<commit_message>
Linarian design: wild Linarian escalation
Co-Authored-By: Claude Opus 5.5 <noreply@anthropic.com>
Claude-Session: https://claude.ai/code/session_01YCWNLtj9zFsogxZeNiDKcG
</commit_message>
<xml_diff>
--- a/Вестницы-дизайн.docx
+++ b/Вестницы-дизайн.docx
@@ -287,7 +287,63 @@
         <w:t>Без фракции</w:t>
       </w:r>
       <w:r>
-        <w:t xml:space="preserve"> (как дикий человек): ночью натравливает зверей или зовёт в глубь региона, к себе.</w:t>
+        <w:t xml:space="preserve"> (как дикий человек) она не обязательно трогает колонию. Её присутствие нарастает:</w:t>
+      </w:r>
+    </w:p>
+    <w:p>
+      <w:r>
+        <w:t xml:space="preserve">  1. </w:t>
+      </w:r>
+      <w:r>
+        <w:rPr>
+          <w:b/>
+        </w:rPr>
+        <w:t>Звери ведут себя странно.</w:t>
+      </w:r>
+      <w:r>
+        <w:t xml:space="preserve"> Ночью дикие звери идут к ней и умирают рядом; у её места копятся кости.</w:t>
+      </w:r>
+    </w:p>
+    <w:p>
+      <w:r>
+        <w:t xml:space="preserve">  2. </w:t>
+      </w:r>
+      <w:r>
+        <w:rPr>
+          <w:b/>
+        </w:rPr>
+        <w:t>Бессонница.</w:t>
+      </w:r>
+      <w:r>
+        <w:t xml:space="preserve"> Некоторые колонисты внезапно просыпаются ночью и получают бессонницу: песня слышна во сне.</w:t>
+      </w:r>
+    </w:p>
+    <w:p>
+      <w:r>
+        <w:t xml:space="preserve">  3. </w:t>
+      </w:r>
+      <w:r>
+        <w:rPr>
+          <w:b/>
+        </w:rPr>
+        <w:t>Охота на колониста.</w:t>
+      </w:r>
+      <w:r>
+        <w:t xml:space="preserve"> Она зовёт пешку игрока сквозь стены. Это видно как спонтанный нервный срыв: пешка встаёт и идёт к ней. Уведомление — письмом о срыве.</w:t>
+      </w:r>
+    </w:p>
+    <w:p>
+      <w:r>
+        <w:t xml:space="preserve">  4. </w:t>
+      </w:r>
+      <w:r>
+        <w:rPr>
+          <w:b/>
+        </w:rPr>
+        <w:t>Ответ игрока.</w:t>
+      </w:r>
+      <w:r>
+        <w:t xml:space="preserve"> Позванную пешку можно посадить в тюрьму (или удержать иначе) — тогда дикая Вестница просто выбирает другую цель.</w:t>
       </w:r>
     </w:p>
     <w:p>

</xml_diff>

<commit_message>
Linarian design: hunting, taming, departure
Co-Authored-By: Claude Opus 5.5 <noreply@anthropic.com>
Claude-Session: https://claude.ai/code/session_01YCWNLtj9zFsogxZeNiDKcG
</commit_message>
<xml_diff>
--- a/Вестницы-дизайн.docx
+++ b/Вестницы-дизайн.docx
@@ -344,6 +344,146 @@
       </w:r>
       <w:r>
         <w:t xml:space="preserve"> Позванную пешку можно посадить в тюрьму (или удержать иначе) — тогда дикая Вестница просто выбирает другую цель.</w:t>
+      </w:r>
+    </w:p>
+    <w:p>
+      <w:pPr>
+        <w:pStyle w:val="ListBullet"/>
+      </w:pPr>
+      <w:r>
+        <w:rPr>
+          <w:b/>
+        </w:rPr>
+        <w:t>Как она охотится.</w:t>
+      </w:r>
+      <w:r>
+        <w:t xml:space="preserve"> Во время охоты она в вуали, её нельзя заметить. Когда применяет пожирание, проявляется в истинном облике на время применения, затем снова уходит в вуаль, а спустя время опять ведёт себя как зверь.</w:t>
+      </w:r>
+    </w:p>
+    <w:p>
+      <w:pPr>
+        <w:pStyle w:val="ListBullet"/>
+      </w:pPr>
+      <w:r>
+        <w:rPr>
+          <w:b/>
+        </w:rPr>
+        <w:t>Бессонница</w:t>
+      </w:r>
+      <w:r>
+        <w:t xml:space="preserve"> — нервный срыв посреди ночи.</w:t>
+      </w:r>
+    </w:p>
+    <w:p>
+      <w:pPr>
+        <w:pStyle w:val="ListBullet"/>
+      </w:pPr>
+      <w:r>
+        <w:rPr>
+          <w:b/>
+        </w:rPr>
+        <w:t>Зов дикой Вестницы</w:t>
+      </w:r>
+      <w:r>
+        <w:t xml:space="preserve"> берёт только одну цель за раз (баланс).</w:t>
+      </w:r>
+    </w:p>
+    <w:p>
+      <w:pPr>
+        <w:pStyle w:val="ListBullet"/>
+      </w:pPr>
+      <w:r>
+        <w:rPr>
+          <w:b/>
+        </w:rPr>
+        <w:t>Позванная пешка</w:t>
+      </w:r>
+      <w:r>
+        <w:t xml:space="preserve"> уходит в лес и падает в сон. Дальше случайно:</w:t>
+      </w:r>
+    </w:p>
+    <w:p>
+      <w:pPr>
+        <w:pStyle w:val="ListBullet2"/>
+      </w:pPr>
+      <w:r>
+        <w:t>Вестница в вуали отпивает часть эссенции — по окончании сна игрок получает пешку обратно;</w:t>
+      </w:r>
+    </w:p>
+    <w:p>
+      <w:pPr>
+        <w:pStyle w:val="ListBullet2"/>
+      </w:pPr>
+      <w:r>
+        <w:t>или проявляется, пожирает пешку целиком и уходит в вуаль.</w:t>
+      </w:r>
+    </w:p>
+    <w:p>
+      <w:pPr>
+        <w:pStyle w:val="ListBullet"/>
+      </w:pPr>
+      <w:r>
+        <w:rPr>
+          <w:b/>
+        </w:rPr>
+        <w:t>Раскрыли, но не поймали</w:t>
+      </w:r>
+      <w:r>
+        <w:t xml:space="preserve"> — она поднимает зверей в рейд. Если колония выжила и зверей не осталось, она уходит с карты.</w:t>
+      </w:r>
+    </w:p>
+    <w:p>
+      <w:pPr>
+        <w:pStyle w:val="ListBullet"/>
+      </w:pPr>
+      <w:r>
+        <w:rPr>
+          <w:b/>
+        </w:rPr>
+        <w:t>Приручение.</w:t>
+      </w:r>
+      <w:r>
+        <w:t xml:space="preserve"> Её можно попробовать приручить, как зверя:</w:t>
+      </w:r>
+    </w:p>
+    <w:p>
+      <w:pPr>
+        <w:pStyle w:val="ListBullet2"/>
+      </w:pPr>
+      <w:r>
+        <w:t>нужно «Животные» 12; шанс успеха 10%;</w:t>
+      </w:r>
+    </w:p>
+    <w:p>
+      <w:pPr>
+        <w:pStyle w:val="ListBullet2"/>
+      </w:pPr>
+      <w:r>
+        <w:t>при успехе она присоединяется к колонии и сразу принимает идеологию Отступнического Дуализма;</w:t>
+      </w:r>
+    </w:p>
+    <w:p>
+      <w:pPr>
+        <w:pStyle w:val="ListBullet2"/>
+      </w:pPr>
+      <w:r>
+        <w:t>при провале вместо охоты она может напугать приручавшего до нервного срыва (паника). В логе взаимодействий: зверь, которого он пытался приручить, заговорил с ним в ответ;</w:t>
+      </w:r>
+    </w:p>
+    <w:p>
+      <w:pPr>
+        <w:pStyle w:val="ListBullet2"/>
+      </w:pPr>
+      <w:r>
+        <w:t>глухие пешки и пешки с железными нервами не срываются;</w:t>
+      </w:r>
+    </w:p>
+    <w:p>
+      <w:pPr>
+        <w:pStyle w:val="ListBullet2"/>
+      </w:pPr>
+      <w:r>
+        <w:t>после — негативная мысль; если был срыв — мысль тяжелее.</w:t>
       </w:r>
     </w:p>
     <w:p>

</xml_diff>

<commit_message>
Linarian design: Primal matriarch escalation
Co-Authored-By: Claude Opus 5.5 <noreply@anthropic.com>
Claude-Session: https://claude.ai/code/session_01YCWNLtj9zFsogxZeNiDKcG
</commit_message>
<xml_diff>
--- a/Вестницы-дизайн.docx
+++ b/Вестницы-дизайн.docx
@@ -494,10 +494,66 @@
         <w:rPr>
           <w:b/>
         </w:rPr>
-        <w:t>У прималистов:</w:t>
+        <w:t>У прималистов (матриарх).</w:t>
       </w:r>
       <w:r>
-        <w:t xml:space="preserve"> рейд по твоей задумке.</w:t>
+        <w:t xml:space="preserve"> В обычном рейде она не приходит. Она тоже появляется зверем, но ведёт себя иначе — эскалация по ночам:</w:t>
+      </w:r>
+    </w:p>
+    <w:p>
+      <w:r>
+        <w:t xml:space="preserve">  1. одиночные бешеные звери с карты нападают на колонию;</w:t>
+      </w:r>
+    </w:p>
+    <w:p>
+      <w:r>
+        <w:t xml:space="preserve">  2. массовое бешенство зверей карты;</w:t>
+      </w:r>
+    </w:p>
+    <w:p>
+      <w:r>
+        <w:t xml:space="preserve">  3. звери приходят извне карты — случайный набор из тех, кто может водиться в этой местности (никаких слонов в ледяном лесу);</w:t>
+      </w:r>
+    </w:p>
+    <w:p>
+      <w:r>
+        <w:t xml:space="preserve">  4. если игрок перебил и их — она поднимает рейд прималистов.</w:t>
+      </w:r>
+    </w:p>
+    <w:p>
+      <w:pPr>
+        <w:pStyle w:val="ListBullet2"/>
+      </w:pPr>
+      <w:r>
+        <w:t>Всё это время по ночам она накладывает Зов или сон на случайных колонистов.</w:t>
+      </w:r>
+    </w:p>
+    <w:p>
+      <w:pPr>
+        <w:pStyle w:val="ListBullet2"/>
+      </w:pPr>
+      <w:r>
+        <w:rPr>
+          <w:b/>
+        </w:rPr>
+        <w:t>Попытка приручить</w:t>
+      </w:r>
+      <w:r>
+        <w:t xml:space="preserve"> матриарха: она набрасывает Зов на приручавшего, пожирает его и сразу поднимает рейд зверей.</w:t>
+      </w:r>
+    </w:p>
+    <w:p>
+      <w:pPr>
+        <w:pStyle w:val="ListBullet"/>
+      </w:pPr>
+      <w:r>
+        <w:rPr>
+          <w:b/>
+        </w:rPr>
+        <w:t>Смысл для игрока:</w:t>
+      </w:r>
+      <w:r>
+        <w:t xml:space="preserve"> даже понимая, что пришла Вестница, нужно наблюдать за ней, чтобы понять, дикая она (можно приручить) или матриарх прималистов (приручение — смерть).</w:t>
       </w:r>
     </w:p>
     <w:p>

</xml_diff>

<commit_message>
Linarian design: capture, predator forms
Co-Authored-By: Claude Opus 5.5 <noreply@anthropic.com>
Claude-Session: https://claude.ai/code/session_01YCWNLtj9zFsogxZeNiDKcG
</commit_message>
<xml_diff>
--- a/Вестницы-дизайн.docx
+++ b/Вестницы-дизайн.docx
@@ -540,6 +540,79 @@
       </w:r>
       <w:r>
         <w:t xml:space="preserve"> матриарха: она набрасывает Зов на приручавшего, пожирает его и сразу поднимает рейд зверей.</w:t>
+      </w:r>
+    </w:p>
+    <w:p>
+      <w:pPr>
+        <w:pStyle w:val="ListBullet2"/>
+      </w:pPr>
+      <w:r>
+        <w:rPr>
+          <w:b/>
+        </w:rPr>
+        <w:t>Захват:</w:t>
+      </w:r>
+      <w:r>
+        <w:t xml:space="preserve"> её можно раскрыть, избить и взять в плен (это не обязательно матриарх — просто Вестница прималистов). В плену она продолжает нападки: рейды, Зов, бессонница; полностью убеждена в своей идеологии. Прекращает, только когда игрок её действительно заполучит (обратит).</w:t>
+      </w:r>
+    </w:p>
+    <w:p>
+      <w:pPr>
+        <w:pStyle w:val="ListBullet2"/>
+      </w:pPr>
+      <w:r>
+        <w:rPr>
+          <w:b/>
+        </w:rPr>
+        <w:t>Без поимки</w:t>
+      </w:r>
+      <w:r>
+        <w:t xml:space="preserve"> цепочка не кончается: Зов на колонистов во время рейдов, бессонница у спящих (в том числе днём) и так далее — пока её не поймают.</w:t>
+      </w:r>
+    </w:p>
+    <w:p>
+      <w:pPr>
+        <w:pStyle w:val="ListBullet2"/>
+      </w:pPr>
+      <w:r>
+        <w:t xml:space="preserve">В отличие от дикой, </w:t>
+      </w:r>
+      <w:r>
+        <w:rPr>
+          <w:b/>
+        </w:rPr>
+        <w:t>прималистка не прячется в вуаль</w:t>
+      </w:r>
+      <w:r>
+        <w:t>, пока действует, — только когда её раскрыли.</w:t>
+      </w:r>
+    </w:p>
+    <w:p>
+      <w:pPr>
+        <w:pStyle w:val="ListBullet"/>
+      </w:pPr>
+      <w:r>
+        <w:rPr>
+          <w:b/>
+        </w:rPr>
+        <w:t>Пожирание</w:t>
+      </w:r>
+      <w:r>
+        <w:t xml:space="preserve"> всегда смерть (по механике).</w:t>
+      </w:r>
+    </w:p>
+    <w:p>
+      <w:pPr>
+        <w:pStyle w:val="ListBullet"/>
+      </w:pPr>
+      <w:r>
+        <w:rPr>
+          <w:b/>
+        </w:rPr>
+        <w:t>Хищные облики — подсказка.</w:t>
+      </w:r>
+      <w:r>
+        <w:t xml:space="preserve"> Все три облика (и олениха, и ворона, и волчица) помечены как хищники, но никогда не охотятся на колонистов игрока, не ведут обычную звериную охоту и не едят растения. Вестница ест тела тех, на кого охотилась; прималистка тоже ест трупы.</w:t>
       </w:r>
     </w:p>
     <w:p>

</xml_diff>

<commit_message>
Design: hunting a Linarian form; Primal camps
Co-Authored-By: Claude Opus 5.5 <noreply@anthropic.com>
Claude-Session: https://claude.ai/code/session_01YCWNLtj9zFsogxZeNiDKcG
</commit_message>
<xml_diff>
--- a/Вестницы-дизайн.docx
+++ b/Вестницы-дизайн.docx
@@ -599,6 +599,34 @@
       </w:r>
       <w:r>
         <w:t xml:space="preserve"> всегда смерть (по механике).</w:t>
+      </w:r>
+    </w:p>
+    <w:p>
+      <w:pPr>
+        <w:pStyle w:val="ListBullet"/>
+      </w:pPr>
+      <w:r>
+        <w:rPr>
+          <w:b/>
+        </w:rPr>
+        <w:t>Охота игрока на облик:</w:t>
+      </w:r>
+      <w:r>
+        <w:t xml:space="preserve"> выстрел или удар её раскрывает (проявляется). Дикая уходит в вуаль и потом по ночам выбирает целью обидчика. Прималистка поднимает рейд зверей и уходит в вуаль.</w:t>
+      </w:r>
+    </w:p>
+    <w:p>
+      <w:pPr>
+        <w:pStyle w:val="ListBullet"/>
+      </w:pPr>
+      <w:r>
+        <w:rPr>
+          <w:b/>
+        </w:rPr>
+        <w:t>Прималисты:</w:t>
+      </w:r>
+      <w:r>
+        <w:t xml:space="preserve"> уровень — животный. Базы — отсутствие всего: ни кроватей, ни спотов, ни складов, только случайные трупы на разной стадии гниения, людей и зверей. Регионы — Сумеречный и Горящий леса.</w:t>
       </w:r>
     </w:p>
     <w:p>

</xml_diff>

<commit_message>
Linarian design: forms are cosmetic, Avir body, masked colours
Co-Authored-By: Claude Opus 5.5 <noreply@anthropic.com>
Claude-Session: https://claude.ai/code/session_01YCWNLtj9zFsogxZeNiDKcG
</commit_message>
<xml_diff>
--- a/Вестницы-дизайн.docx
+++ b/Вестницы-дизайн.docx
@@ -33,7 +33,41 @@
     </w:p>
     <w:p>
       <w:r>
-        <w:t>Смена облика — одна из тактик в меню кнопки «Тактика охоты» (раздел 3). В облике Вестница остаётся собой: та же пешка, тот же разум, та же Песнь. Меняется только тело.</w:t>
+        <w:t xml:space="preserve">Смена облика — одна из тактик в меню кнопки «Тактика охоты» (раздел 3). </w:t>
+      </w:r>
+      <w:r>
+        <w:rPr>
+          <w:b/>
+        </w:rPr>
+        <w:t>Механически пешка остаётся Вестницей</w:t>
+      </w:r>
+      <w:r>
+        <w:t>, зверем не становится:</w:t>
+      </w:r>
+    </w:p>
+    <w:p>
+      <w:pPr>
+        <w:pStyle w:val="ListBullet"/>
+      </w:pPr>
+      <w:r>
+        <w:t>тот же Голод, та же Песнь, те же навыки и снаряжение;</w:t>
+      </w:r>
+    </w:p>
+    <w:p>
+      <w:pPr>
+        <w:pStyle w:val="ListBullet"/>
+      </w:pPr>
+      <w:r>
+        <w:t xml:space="preserve">меняется </w:t>
+      </w:r>
+      <w:r>
+        <w:rPr>
+          <w:b/>
+        </w:rPr>
+        <w:t>только вид и способ передвижения</w:t>
+      </w:r>
+      <w:r>
+        <w:t>;</w:t>
       </w:r>
     </w:p>
     <w:p>
@@ -44,56 +78,10 @@
         <w:rPr>
           <w:b/>
         </w:rPr>
-        <w:t>Общее для всех обликов:</w:t>
-      </w:r>
-    </w:p>
-    <w:p>
-      <w:pPr>
-        <w:pStyle w:val="ListBullet2"/>
-      </w:pPr>
-      <w:r>
-        <w:t xml:space="preserve">враги-пешки и турели </w:t>
+        <w:t>ворона</w:t>
       </w:r>
       <w:r>
-        <w:rPr>
-          <w:b/>
-        </w:rPr>
-        <w:t>не выбирают её целью</w:t>
-      </w:r>
-      <w:r>
-        <w:t xml:space="preserve"> — она просто красивый зверь;</w:t>
-      </w:r>
-    </w:p>
-    <w:p>
-      <w:pPr>
-        <w:pStyle w:val="ListBullet2"/>
-      </w:pPr>
-      <w:r>
-        <w:t>маскировка слетает, если она атакует или применяет боевую тактику;</w:t>
-      </w:r>
-    </w:p>
-    <w:p>
-      <w:pPr>
-        <w:pStyle w:val="ListBullet2"/>
-      </w:pPr>
-      <w:r>
-        <w:t>работать в облике она не может (ей и так нельзя простую работу), одежда и оружие не видны;</w:t>
-      </w:r>
-    </w:p>
-    <w:p>
-      <w:pPr>
-        <w:pStyle w:val="ListBullet2"/>
-      </w:pPr>
-      <w:r>
-        <w:t>песня-аура продолжает звучать;</w:t>
-      </w:r>
-    </w:p>
-    <w:p>
-      <w:pPr>
-        <w:pStyle w:val="ListBullet2"/>
-      </w:pPr>
-      <w:r>
-        <w:t>глухие пешки, механоиды и охотницы с «чутьём хищника» её раскрывают, как и вуаль.</w:t>
+        <w:t xml:space="preserve"> — единственная с механическим отличием: перелетает через препятствия;</w:t>
       </w:r>
     </w:p>
     <w:p>
@@ -101,34 +89,7 @@
         <w:pStyle w:val="ListBullet"/>
       </w:pPr>
       <w:r>
-        <w:rPr>
-          <w:b/>
-        </w:rPr>
-        <w:t>Ворона:</w:t>
-      </w:r>
-    </w:p>
-    <w:p>
-      <w:pPr>
-        <w:pStyle w:val="ListBullet2"/>
-      </w:pPr>
-      <w:r>
-        <w:t>полёт через стены и препятствия, высокая скорость;</w:t>
-      </w:r>
-    </w:p>
-    <w:p>
-      <w:pPr>
-        <w:pStyle w:val="ListBullet2"/>
-      </w:pPr>
-      <w:r>
-        <w:t>ничего не несёт;</w:t>
-      </w:r>
-    </w:p>
-    <w:p>
-      <w:pPr>
-        <w:pStyle w:val="ListBullet2"/>
-      </w:pPr>
-      <w:r>
-        <w:t>хрупкая: мало здоровья, если её всё-таки поймали.</w:t>
+        <w:t>враги-пешки и турели не выбирают её целью — она просто красивый зверь; маскировка слетает, если она атакует, применяет боевую тактику или по ней ударили;</w:t>
       </w:r>
     </w:p>
     <w:p>
@@ -136,34 +97,7 @@
         <w:pStyle w:val="ListBullet"/>
       </w:pPr>
       <w:r>
-        <w:rPr>
-          <w:b/>
-        </w:rPr>
-        <w:t>Олениха:</w:t>
-      </w:r>
-    </w:p>
-    <w:p>
-      <w:pPr>
-        <w:pStyle w:val="ListBullet2"/>
-      </w:pPr>
-      <w:r>
-        <w:t>очень быстрый бег;</w:t>
-      </w:r>
-    </w:p>
-    <w:p>
-      <w:pPr>
-        <w:pStyle w:val="ListBullet2"/>
-      </w:pPr>
-      <w:r>
-        <w:t>дикие звери не пугаются и не убегают — удобно для Охоты песней;</w:t>
-      </w:r>
-    </w:p>
-    <w:p>
-      <w:pPr>
-        <w:pStyle w:val="ListBullet2"/>
-      </w:pPr>
-      <w:r>
-        <w:t>пасётся сама: не нужна обычная еда, только Голод.</w:t>
+        <w:t>глухие пешки, механоиды, турели и охотницы с «чутьём хищника» её раскрывают, как и вуаль;</w:t>
       </w:r>
     </w:p>
     <w:p>
@@ -171,53 +105,23 @@
         <w:pStyle w:val="ListBullet"/>
       </w:pPr>
       <w:r>
-        <w:rPr>
-          <w:b/>
-        </w:rPr>
-        <w:t>Волчица:</w:t>
+        <w:t>вернуться в свой облик — в любой момент.</w:t>
       </w:r>
     </w:p>
     <w:p>
-      <w:pPr>
-        <w:pStyle w:val="ListBullet2"/>
-      </w:pPr>
       <w:r>
-        <w:t>укус и сила в ближнем бою;</w:t>
+        <w:t>Технически: подмена отрисовки тела на зверя плюс способ движения; ничего не теряется.</w:t>
       </w:r>
     </w:p>
     <w:p>
-      <w:pPr>
-        <w:pStyle w:val="ListBullet2"/>
-      </w:pPr>
-      <w:r>
-        <w:t>волки и псовые на карте идут следом, как стая;</w:t>
-      </w:r>
-    </w:p>
-    <w:p>
-      <w:pPr>
-        <w:pStyle w:val="ListBullet2"/>
-      </w:pPr>
-      <w:r>
-        <w:t>Охота песней сильнее (крупнее звери).</w:t>
-      </w:r>
-    </w:p>
-    <w:p>
-      <w:pPr>
-        <w:pStyle w:val="ListBullet"/>
-      </w:pPr>
       <w:r>
         <w:rPr>
           <w:b/>
         </w:rPr>
-        <w:t>Возврат в свой облик</w:t>
+        <w:t>Цвет обликов</w:t>
       </w:r>
       <w:r>
-        <w:t xml:space="preserve"> — в любой момент, кнопкой.</w:t>
-      </w:r>
-    </w:p>
-    <w:p>
-      <w:r>
-        <w:t>Технически: тело Вестницы рисуется зверем (подмена отрисовки), характеристики меняются через состояние облика. Это надёжнее, чем подменять пешку настоящим животным, и ничего не теряется: ни снаряжение, ни отношения, ни навыки.</w:t>
+        <w:t xml:space="preserve"> наследуется от оперения Вестницы: звери рисуются в оттенках серого с цветовой маской, как крылья Авир, и красятся в её цвета.</w:t>
       </w:r>
     </w:p>
     <w:p>
@@ -674,6 +578,20 @@
       </w:r>
     </w:p>
     <w:p>
+      <w:r>
+        <w:t xml:space="preserve">Тело — то же, что у Авир; меняются только крылья и хвост. Пропорции: обычная авийка, но </w:t>
+      </w:r>
+      <w:r>
+        <w:rPr>
+          <w:b/>
+        </w:rPr>
+        <w:t>тоньше и чуть ниже</w:t>
+      </w:r>
+      <w:r>
+        <w:t xml:space="preserve"> — чуть выше и тоньше человека.</w:t>
+      </w:r>
+    </w:p>
+    <w:p>
       <w:pPr>
         <w:ind w:left="240"/>
       </w:pPr>
@@ -683,7 +601,7 @@
           <w:color w:val="202050"/>
           <w:sz w:val="19"/>
         </w:rPr>
-        <w:t>Concept art of a single Avir woman from a dark fantasy setting: a tall, feathered avian humanoid with a hooked raptor beak, tufted lynx-like ears and a long feathered braid running from her head almost to her tail. Her body is larger than an ordinary Avir's.</w:t>
+        <w:t>Concept art of a single Avir woman from a dark fantasy setting: a feathered avian humanoid with a hooked raptor beak, tufted lynx-like ears and a long feathered braid running from her head almost to her tail. She has the ordinary Avir body, but slimmer and a little shorter than an ordinary Avir - only slightly taller and thinner than a human.</w:t>
         <w:br/>
       </w:r>
       <w:r>
@@ -692,7 +610,7 @@
           <w:color w:val="202050"/>
           <w:sz w:val="19"/>
         </w:rPr>
-        <w:t>Four feathered bird wings in two pairs - not insect or butterfly wings. The lower pair is slightly longer and grows from beneath the upper pair, framing it like a second, larger outline of the same wing. The feathers are snow-white with a soft amber shimmer, as if lit by starlight.</w:t>
+        <w:t>Four feathered bird wings in two pairs - not insect or butterfly wings. The lower pair is slightly longer and grows from beneath the upper pair, framing it like a second, larger outline of the same wing.</w:t>
         <w:br/>
       </w:r>
       <w:r>
@@ -710,7 +628,7 @@
           <w:color w:val="202050"/>
           <w:sz w:val="19"/>
         </w:rPr>
-        <w:t>Amber glowing eyes. She wears only a simple loincloth with an old ornament; no armour, no jewellery.</w:t>
+        <w:t>She wears only a simple loincloth with an old ornament; no armour, no jewellery.</w:t>
         <w:br/>
       </w:r>
       <w:r>
@@ -727,12 +645,21 @@
         <w:pStyle w:val="Heading2"/>
       </w:pPr>
       <w:r>
-        <w:t>2.2. Крылья Вестницы для игры (как у Авир: серые, с маской)</w:t>
+        <w:t>2.2. Крылья Вестницы для игры (сложенные и раскрытые)</w:t>
       </w:r>
     </w:p>
     <w:p>
       <w:r>
-        <w:t>Как у существующих крыльев Авир: белые/серые перья, толстый чёрный контур, три вида. Цветовую маску (красное/зелёное) сделаю сам.</w:t>
+        <w:t xml:space="preserve">Как у существующих крыльев Авир: белые и серые перья, толстый чёрный контур, три вида, в двух положениях. </w:t>
+      </w:r>
+      <w:r>
+        <w:rPr>
+          <w:b/>
+        </w:rPr>
+        <w:t>Цветовую маску</w:t>
+      </w:r>
+      <w:r>
+        <w:t xml:space="preserve"> (красное — основной цвет, зелёное — кончики перьев) сделаю сам по образцу крыльев Авир.</w:t>
       </w:r>
     </w:p>
     <w:p>
@@ -763,7 +690,7 @@
           <w:color w:val="202050"/>
           <w:sz w:val="19"/>
         </w:rPr>
-        <w:t>Top row - wings folded against the back: seen from the south (from behind the viewer, front of the character), from the east (side), and from the north (from behind the character).</w:t>
+        <w:t>Top row - both pairs folded against the back: seen from the south (front of the character), from the east (side), and from the north (back of the character).</w:t>
         <w:br/>
       </w:r>
       <w:r>
@@ -772,7 +699,7 @@
           <w:color w:val="202050"/>
           <w:sz w:val="19"/>
         </w:rPr>
-        <w:t>Bottom row - wings fully spread: south, east and north.</w:t>
+        <w:t>Bottom row - both pairs fully spread: south, east and north.</w:t>
         <w:br/>
       </w:r>
       <w:r>
@@ -833,7 +760,16 @@
     </w:p>
     <w:p>
       <w:r>
-        <w:t>Звери в стиле животных RimWorld, в трёх видах каждый. Их отличие от обычных зверей — белые перья или шерсть с янтарным отсветом и светящиеся янтарные глаза.</w:t>
+        <w:t xml:space="preserve">Звери </w:t>
+      </w:r>
+      <w:r>
+        <w:rPr>
+          <w:b/>
+        </w:rPr>
+        <w:t>в белом и сером</w:t>
+      </w:r>
+      <w:r>
+        <w:t>: цвет каждой Вестницы игра наложит по маске (её оперение). Маски сделаю сам.</w:t>
       </w:r>
     </w:p>
     <w:p>
@@ -855,6 +791,15 @@
           <w:color w:val="202050"/>
           <w:sz w:val="19"/>
         </w:rPr>
+        <w:t>All three animals are drawn in white and light grey only, so they can be tinted later.</w:t>
+        <w:br/>
+      </w:r>
+      <w:r>
+        <w:rPr>
+          <w:rFonts w:ascii="Consolas" w:hAnsi="Consolas"/>
+          <w:color w:val="202050"/>
+          <w:sz w:val="19"/>
+        </w:rPr>
         <w:t>Each row is one animal in three views - from the south (facing the viewer), from the east (side, facing right), from the north (facing away).</w:t>
         <w:br/>
       </w:r>
@@ -864,7 +809,7 @@
           <w:color w:val="202050"/>
           <w:sz w:val="19"/>
         </w:rPr>
-        <w:t>Row 1: a crow with snow-white feathers that have a faint amber shimmer, amber glowing eyes.</w:t>
+        <w:t>Row 1: a crow.</w:t>
         <w:br/>
       </w:r>
       <w:r>
@@ -873,7 +818,7 @@
           <w:color w:val="202050"/>
           <w:sz w:val="19"/>
         </w:rPr>
-        <w:t>Row 2: a slender doe with pale white fur with a faint amber shimmer, amber glowing eyes.</w:t>
+        <w:t>Row 2: a slender doe.</w:t>
         <w:br/>
       </w:r>
       <w:r>
@@ -882,7 +827,7 @@
           <w:color w:val="202050"/>
           <w:sz w:val="19"/>
         </w:rPr>
-        <w:t>Row 3: a she-wolf with white fur with a faint amber shimmer, amber glowing eyes.</w:t>
+        <w:t>Row 3: a she-wolf.</w:t>
         <w:br/>
       </w:r>
       <w:r>
@@ -891,7 +836,7 @@
           <w:color w:val="202050"/>
           <w:sz w:val="19"/>
         </w:rPr>
-        <w:t>They look almost like ordinary animals, only subtly too beautiful and too bright for the wild.</w:t>
+        <w:t>They look almost like ordinary animals, only subtly too graceful and too beautiful for the wild.</w:t>
         <w:br/>
       </w:r>
       <w:r>

</xml_diff>

<commit_message>
Linarian prompts: reference-based, with wing references
Co-Authored-By: Claude Opus 5.5 <noreply@anthropic.com>
Claude-Session: https://claude.ai/code/session_01YCWNLtj9zFsogxZeNiDKcG
</commit_message>
<xml_diff>
--- a/Вестницы-дизайн.docx
+++ b/Вестницы-дизайн.docx
@@ -645,21 +645,26 @@
         <w:pStyle w:val="Heading2"/>
       </w:pPr>
       <w:r>
-        <w:t>2.2. Крылья Вестницы для игры (сложенные и раскрытые)</w:t>
+        <w:t>2.2. Крылья — по образцу (6 генераций)</w:t>
       </w:r>
     </w:p>
     <w:p>
       <w:r>
-        <w:t xml:space="preserve">Как у существующих крыльев Авир: белые и серые перья, толстый чёрный контур, три вида, в двух положениях. </w:t>
+        <w:t>Генератору проще дорисовать готовое, чем выдумать вид сверху. Референсы — в архиве «Вестницы-референсы.zip»: нынешние крылья Авир, сложенные и раскрытые, вид спереди, сбоку и сзади.</w:t>
+      </w:r>
+    </w:p>
+    <w:p>
+      <w:r>
+        <w:t xml:space="preserve">Прикрепи </w:t>
       </w:r>
       <w:r>
         <w:rPr>
           <w:b/>
         </w:rPr>
-        <w:t>Цветовую маску</w:t>
+        <w:t>одну</w:t>
       </w:r>
       <w:r>
-        <w:t xml:space="preserve"> (красное — основной цвет, зелёное — кончики перьев) сделаю сам по образцу крыльев Авир.</w:t>
+        <w:t xml:space="preserve"> картинку из архива и отправь этот промпт; повтори для каждой из шести:</w:t>
       </w:r>
     </w:p>
     <w:p>
@@ -672,43 +677,7 @@
           <w:color w:val="202050"/>
           <w:sz w:val="19"/>
         </w:rPr>
-        <w:t>A sprite sheet of game textures for a top-down RimWorld-style character, in the exact style of hand-drawn RimWorld body parts: white and light grey feathers with soft grey shading, one thick black outline, no background, no body, wings only.</w:t>
-        <w:br/>
-      </w:r>
-      <w:r>
-        <w:rPr>
-          <w:rFonts w:ascii="Consolas" w:hAnsi="Consolas"/>
-          <w:color w:val="202050"/>
-          <w:sz w:val="19"/>
-        </w:rPr>
-        <w:t>Two pairs of feathered bird wings on one creature: the lower pair slightly longer and growing from beneath the upper pair, framing it like a second outline. Not insect or butterfly wings.</w:t>
-        <w:br/>
-      </w:r>
-      <w:r>
-        <w:rPr>
-          <w:rFonts w:ascii="Consolas" w:hAnsi="Consolas"/>
-          <w:color w:val="202050"/>
-          <w:sz w:val="19"/>
-        </w:rPr>
-        <w:t>Top row - both pairs folded against the back: seen from the south (front of the character), from the east (side), and from the north (back of the character).</w:t>
-        <w:br/>
-      </w:r>
-      <w:r>
-        <w:rPr>
-          <w:rFonts w:ascii="Consolas" w:hAnsi="Consolas"/>
-          <w:color w:val="202050"/>
-          <w:sz w:val="19"/>
-        </w:rPr>
-        <w:t>Bottom row - both pairs fully spread: south, east and north.</w:t>
-        <w:br/>
-      </w:r>
-      <w:r>
-        <w:rPr>
-          <w:rFonts w:ascii="Consolas" w:hAnsi="Consolas"/>
-          <w:color w:val="202050"/>
-          <w:sz w:val="19"/>
-        </w:rPr>
-        <w:t>Each view alone in its own equal square cell with clear empty space between cells. Transparent background, no text.</w:t>
+        <w:t>Redraw these exact wings in the same style, size, line weight and shading, keeping exactly the same view and composition. Add a second pair of feathered bird wings growing from beneath the existing pair: the lower pair is slightly longer and frames the upper pair like a second, larger outline of the same wing. Same white and light grey feathers, same thick black outline. Not insect or butterfly wings. Transparent background, nothing else.</w:t>
       </w:r>
     </w:p>
     <w:p>
@@ -716,7 +685,42 @@
         <w:pStyle w:val="Heading2"/>
       </w:pPr>
       <w:r>
-        <w:t>2.3. Раздвоенный хвост</w:t>
+        <w:t>2.3. Хвост — по образцу (3 генерации)</w:t>
+      </w:r>
+    </w:p>
+    <w:p>
+      <w:r>
+        <w:t>Хвост Авир берётся из стороннего мода, у меня его файла нет. Нужны его три вида (</w:t>
+      </w:r>
+      <w:r>
+        <w:rPr>
+          <w:rFonts w:ascii="Consolas" w:hAnsi="Consolas"/>
+          <w:sz w:val="20"/>
+        </w:rPr>
+        <w:t>AvirGriffinTail_south</w:t>
+      </w:r>
+      <w:r>
+        <w:t xml:space="preserve">, </w:t>
+      </w:r>
+      <w:r>
+        <w:rPr>
+          <w:rFonts w:ascii="Consolas" w:hAnsi="Consolas"/>
+          <w:sz w:val="20"/>
+        </w:rPr>
+        <w:t>_east</w:t>
+      </w:r>
+      <w:r>
+        <w:t xml:space="preserve">, </w:t>
+      </w:r>
+      <w:r>
+        <w:rPr>
+          <w:rFonts w:ascii="Consolas" w:hAnsi="Consolas"/>
+          <w:sz w:val="20"/>
+        </w:rPr>
+        <w:t>_north</w:t>
+      </w:r>
+      <w:r>
+        <w:t>) из твоей установки. Прикрепи по одному:</w:t>
       </w:r>
     </w:p>
     <w:p>
@@ -729,25 +733,7 @@
           <w:color w:val="202050"/>
           <w:sz w:val="19"/>
         </w:rPr>
-        <w:t>A sprite sheet of game textures for a top-down RimWorld-style character, in the exact style of hand-drawn RimWorld body parts: white and light grey feathers with soft grey shading, one thick black outline, no body, tail only.</w:t>
-        <w:br/>
-      </w:r>
-      <w:r>
-        <w:rPr>
-          <w:rFonts w:ascii="Consolas" w:hAnsi="Consolas"/>
-          <w:color w:val="202050"/>
-          <w:sz w:val="19"/>
-        </w:rPr>
-        <w:t>A tail forked from a single bone into two long feathered rudders, like a swallow's tail.</w:t>
-        <w:br/>
-      </w:r>
-      <w:r>
-        <w:rPr>
-          <w:rFonts w:ascii="Consolas" w:hAnsi="Consolas"/>
-          <w:color w:val="202050"/>
-          <w:sz w:val="19"/>
-        </w:rPr>
-        <w:t>Three views in one row: from the south, from the east (side), from the north. Each view alone in its own equal square cell with clear empty space between cells. Transparent background, no text.</w:t>
+        <w:t>Redraw this exact tail in the same style, size, line weight and shading, keeping exactly the same view and composition, but fork it from a single bone near the base into two long feathered rudders, like a swallow's tail. White and light grey only, thick black outline. Transparent background, nothing else.</w:t>
       </w:r>
     </w:p>
     <w:p>
@@ -755,21 +741,12 @@
         <w:pStyle w:val="Heading2"/>
       </w:pPr>
       <w:r>
-        <w:t>2.4. Звериные облики (лист 3×3)</w:t>
+        <w:t>2.4. Звериные облики (3 генерации)</w:t>
       </w:r>
     </w:p>
     <w:p>
       <w:r>
-        <w:t xml:space="preserve">Звери </w:t>
-      </w:r>
-      <w:r>
-        <w:rPr>
-          <w:b/>
-        </w:rPr>
-        <w:t>в белом и сером</w:t>
-      </w:r>
-      <w:r>
-        <w:t>: цвет каждой Вестницы игра наложит по маске (её оперение). Маски сделаю сам.</w:t>
+        <w:t>Белые и серые; цвет даст маска (её сделаю сам). Если удобно, приложи скриншот такого зверя из игры как образец стиля.</w:t>
       </w:r>
     </w:p>
     <w:p>
@@ -782,7 +759,7 @@
           <w:color w:val="202050"/>
           <w:sz w:val="19"/>
         </w:rPr>
-        <w:t>A sprite sheet of nine game animal textures in the exact style of RimWorld animals: flat hand-drawn shapes, soft shading, one thick dark outline, seen from slightly above, no background, no shadow.</w:t>
+        <w:t>Three game textures of one animal in the exact style of RimWorld animals: flat hand-drawn shapes, soft grey shading, one thick dark outline, seen from slightly above, white and light grey only so it can be tinted later. One row, three views: from the south (facing the viewer), from the east (side, facing right), from the north (facing away). Each view alone in its own equal square cell with clear empty space between cells. The animal looks almost ordinary, only subtly too graceful and too beautiful for the wild. Transparent background, no text, no shadow.</w:t>
         <w:br/>
       </w:r>
       <w:r>
@@ -791,61 +768,7 @@
           <w:color w:val="202050"/>
           <w:sz w:val="19"/>
         </w:rPr>
-        <w:t>All three animals are drawn in white and light grey only, so they can be tinted later.</w:t>
-        <w:br/>
-      </w:r>
-      <w:r>
-        <w:rPr>
-          <w:rFonts w:ascii="Consolas" w:hAnsi="Consolas"/>
-          <w:color w:val="202050"/>
-          <w:sz w:val="19"/>
-        </w:rPr>
-        <w:t>Each row is one animal in three views - from the south (facing the viewer), from the east (side, facing right), from the north (facing away).</w:t>
-        <w:br/>
-      </w:r>
-      <w:r>
-        <w:rPr>
-          <w:rFonts w:ascii="Consolas" w:hAnsi="Consolas"/>
-          <w:color w:val="202050"/>
-          <w:sz w:val="19"/>
-        </w:rPr>
-        <w:t>Row 1: a crow.</w:t>
-        <w:br/>
-      </w:r>
-      <w:r>
-        <w:rPr>
-          <w:rFonts w:ascii="Consolas" w:hAnsi="Consolas"/>
-          <w:color w:val="202050"/>
-          <w:sz w:val="19"/>
-        </w:rPr>
-        <w:t>Row 2: a slender doe.</w:t>
-        <w:br/>
-      </w:r>
-      <w:r>
-        <w:rPr>
-          <w:rFonts w:ascii="Consolas" w:hAnsi="Consolas"/>
-          <w:color w:val="202050"/>
-          <w:sz w:val="19"/>
-        </w:rPr>
-        <w:t>Row 3: a she-wolf.</w:t>
-        <w:br/>
-      </w:r>
-      <w:r>
-        <w:rPr>
-          <w:rFonts w:ascii="Consolas" w:hAnsi="Consolas"/>
-          <w:color w:val="202050"/>
-          <w:sz w:val="19"/>
-        </w:rPr>
-        <w:t>They look almost like ordinary animals, only subtly too graceful and too beautiful for the wild.</w:t>
-        <w:br/>
-      </w:r>
-      <w:r>
-        <w:rPr>
-          <w:rFonts w:ascii="Consolas" w:hAnsi="Consolas"/>
-          <w:color w:val="202050"/>
-          <w:sz w:val="19"/>
-        </w:rPr>
-        <w:t>Each view alone in its own equal square cell with clear empty space between cells. Transparent background, no text.</w:t>
+        <w:t>The animal: [a crow / a slender doe / a she-wolf].</w:t>
       </w:r>
     </w:p>
     <w:p>

</xml_diff>

<commit_message>
FIXES-ZM: Song network as 8 rings and the shadow of the Flow (45 stones), Dreaming, Cult, Feast, black fog, eternal night; Herald docs and icon prompts
Co-Authored-By: Claude Opus 5.5 <noreply@anthropic.com>
Claude-Session: https://claude.ai/code/session_01YCWNLtj9zFsogxZeNiDKcG
</commit_message>
<xml_diff>
--- a/Вестницы-дизайн.docx
+++ b/Вестницы-дизайн.docx
@@ -12,7 +12,7 @@
     </w:p>
     <w:p>
       <w:r>
-        <w:t>Черновик на обсуждение. Всё здесь можно менять; кода ещё нет.</w:t>
+        <w:t>Сделано в FIXES-ZM. Раздел 3 описывает то, что уже в коде; разделы 1–2 — облики и промпты внешности.</w:t>
       </w:r>
     </w:p>
     <w:p>
@@ -776,7 +776,7 @@
         <w:pStyle w:val="Heading1"/>
       </w:pPr>
       <w:r>
-        <w:t>3. Песнь — черновик системы</w:t>
+        <w:t>3. Песнь (как сделано в FIXES-ZM)</w:t>
       </w:r>
     </w:p>
     <w:p>
@@ -784,7 +784,7 @@
         <w:pStyle w:val="Heading2"/>
       </w:pPr>
       <w:r>
-        <w:t>3.1. Навык «Песнь» (0–20)</w:t>
+        <w:t>3.1. Опыт и очки</w:t>
       </w:r>
     </w:p>
     <w:p>
@@ -792,7 +792,7 @@
         <w:pStyle w:val="ListBullet"/>
       </w:pPr>
       <w:r>
-        <w:t>Хранится в гене Песни, показан во вкладке Вестницы (не в общем списке навыков).</w:t>
+        <w:t>Песнь растёт как опыт артефакта: от вуали и обликов, тактик, пожирания, Охоты песней, ночей медленного пожирания.</w:t>
       </w:r>
     </w:p>
     <w:p>
@@ -800,39 +800,7 @@
         <w:pStyle w:val="ListBullet"/>
       </w:pPr>
       <w:r>
-        <w:t>Опыт идёт:</w:t>
-      </w:r>
-    </w:p>
-    <w:p>
-      <w:pPr>
-        <w:pStyle w:val="ListBullet2"/>
-      </w:pPr>
-      <w:r>
-        <w:t>от времени в песне-ауре;</w:t>
-      </w:r>
-    </w:p>
-    <w:p>
-      <w:pPr>
-        <w:pStyle w:val="ListBullet2"/>
-      </w:pPr>
-      <w:r>
-        <w:t>от применения тактик;</w:t>
-      </w:r>
-    </w:p>
-    <w:p>
-      <w:pPr>
-        <w:pStyle w:val="ListBullet2"/>
-      </w:pPr>
-      <w:r>
-        <w:t>от Охоты песней;</w:t>
-      </w:r>
-    </w:p>
-    <w:p>
-      <w:pPr>
-        <w:pStyle w:val="ListBullet2"/>
-      </w:pPr>
-      <w:r>
-        <w:t>от Похищения эссенции под Зовом.</w:t>
+        <w:t>Каждый порог опыта даёт очко сети. На старте 2 очка.</w:t>
       </w:r>
     </w:p>
     <w:p>
@@ -840,7 +808,7 @@
         <w:pStyle w:val="ListBullet"/>
       </w:pPr>
       <w:r>
-        <w:t>Каждый уровень даёт очки развития для сети. Уровень также усиливает всё сразу: радиус ауры, число целей, силу тактик, размер зверей для Охоты песней.</w:t>
+        <w:t>Требований уровня у камней нет.</w:t>
       </w:r>
     </w:p>
     <w:p>
@@ -848,7 +816,7 @@
         <w:pStyle w:val="Heading2"/>
       </w:pPr>
       <w:r>
-        <w:t>3.2. Предел и сопротивление</w:t>
+        <w:t>3.2. Сила и сопротивление</w:t>
       </w:r>
     </w:p>
     <w:p>
@@ -859,10 +827,34 @@
         <w:rPr>
           <w:b/>
         </w:rPr>
-        <w:t>Сила Вестницы</w:t>
+        <w:t>Сила Песни</w:t>
       </w:r>
       <w:r>
-        <w:t xml:space="preserve"> = Песнь × её психочувствительность.</w:t>
+        <w:t xml:space="preserve"> складывается из глубины Песни и её психочувствительности. Её усиливают:</w:t>
+      </w:r>
+    </w:p>
+    <w:p>
+      <w:pPr>
+        <w:pStyle w:val="ListBullet2"/>
+      </w:pPr>
+      <w:r>
+        <w:t>коллекция голосов (Пиршество);</w:t>
+      </w:r>
+    </w:p>
+    <w:p>
+      <w:pPr>
+        <w:pStyle w:val="ListBullet2"/>
+      </w:pPr>
+      <w:r>
+        <w:t>поток карты (Тень);</w:t>
+      </w:r>
+    </w:p>
+    <w:p>
+      <w:pPr>
+        <w:pStyle w:val="ListBullet2"/>
+      </w:pPr>
+      <w:r>
+        <w:t>ночь (вершина Тени).</w:t>
       </w:r>
     </w:p>
     <w:p>
@@ -873,10 +865,42 @@
         <w:rPr>
           <w:b/>
         </w:rPr>
-        <w:t>Сопротивление цели</w:t>
+        <w:t>Шанс подчинить</w:t>
       </w:r>
       <w:r>
-        <w:t xml:space="preserve"> растёт, чем ниже её чувствительность: глухие (0) недоступны вовсе. Механоиды недоступны.</w:t>
+        <w:t xml:space="preserve"> — сила против чувствительности цели:</w:t>
+      </w:r>
+    </w:p>
+    <w:p>
+      <w:pPr>
+        <w:pStyle w:val="ListBullet2"/>
+      </w:pPr>
+      <w:r>
+        <w:t>глухие, механоиды, иллитиды, Старший мозг и другие Вестницы недоступны;</w:t>
+      </w:r>
+    </w:p>
+    <w:p>
+      <w:pPr>
+        <w:pStyle w:val="ListBullet2"/>
+      </w:pPr>
+      <w:r>
+        <w:t>пилон против дронов и штормовой амулет защищают;</w:t>
+      </w:r>
+    </w:p>
+    <w:p>
+      <w:pPr>
+        <w:pStyle w:val="ListBullet2"/>
+      </w:pPr>
+      <w:r>
+        <w:t>психопаты и железная воля — вдвое труднее;</w:t>
+      </w:r>
+    </w:p>
+    <w:p>
+      <w:pPr>
+        <w:pStyle w:val="ListBullet2"/>
+      </w:pPr>
+      <w:r>
+        <w:t>спящие, меченые шрамом и обожающие — легче.</w:t>
       </w:r>
     </w:p>
     <w:p>
@@ -884,29 +908,7 @@
         <w:pStyle w:val="ListBullet"/>
       </w:pPr>
       <w:r>
-        <w:rPr>
-          <w:b/>
-        </w:rPr>
-        <w:t>Число целей</w:t>
-      </w:r>
-      <w:r>
-        <w:t xml:space="preserve"> одной тактики растёт с силой Вестницы.</w:t>
-      </w:r>
-    </w:p>
-    <w:p>
-      <w:pPr>
-        <w:pStyle w:val="ListBullet"/>
-      </w:pPr>
-      <w:r>
-        <w:t>Пешки с сильной волей (черты, фанатизм) сопротивляются сильнее.</w:t>
-      </w:r>
-    </w:p>
-    <w:p>
-      <w:pPr>
-        <w:pStyle w:val="ListBullet"/>
-      </w:pPr>
-      <w:r>
-        <w:t>Против Вестниц, Старшего мозга и иллитидов тактики не действуют. Сами Вестницы неуязвимы для любой психической способности.</w:t>
+        <w:t>Сами Вестницы неуязвимы для любой психической способности.</w:t>
       </w:r>
     </w:p>
     <w:p>
@@ -918,11 +920,8 @@
       </w:r>
     </w:p>
     <w:p>
-      <w:pPr>
-        <w:pStyle w:val="ListBullet"/>
-      </w:pPr>
       <w:r>
-        <w:t>Вуаль — невидимость, в которую Вестница уходит очень часто.</w:t>
+        <w:t>Вуаль срывают рядом с ней:</w:t>
       </w:r>
     </w:p>
     <w:p>
@@ -930,7 +929,785 @@
         <w:pStyle w:val="ListBullet"/>
       </w:pPr>
       <w:r>
-        <w:t>Вуаль срывают рядом с ней:</w:t>
+        <w:t>глухие — сразу, слабочувствительные — с шансом;</w:t>
+      </w:r>
+    </w:p>
+    <w:p>
+      <w:pPr>
+        <w:pStyle w:val="ListBullet"/>
+      </w:pPr>
+      <w:r>
+        <w:t>турели и механоиды;</w:t>
+      </w:r>
+    </w:p>
+    <w:p>
+      <w:pPr>
+        <w:pStyle w:val="ListBullet"/>
+      </w:pPr>
+      <w:r>
+        <w:t>охотницы с «чутьём хищника».</w:t>
+      </w:r>
+    </w:p>
+    <w:p>
+      <w:r>
+        <w:t>Её спящие и обожающие раскрыть её не могут.</w:t>
+      </w:r>
+    </w:p>
+    <w:p>
+      <w:pPr>
+        <w:pStyle w:val="Heading2"/>
+      </w:pPr>
+      <w:r>
+        <w:t>3.4. Кнопка тактик</w:t>
+      </w:r>
+    </w:p>
+    <w:p>
+      <w:pPr>
+        <w:pStyle w:val="ListBullet"/>
+      </w:pPr>
+      <w:r>
+        <w:t>Одна кнопка; правый клик открывает меню тактик, сгруппированное по путям, и пресеты.</w:t>
+      </w:r>
+    </w:p>
+    <w:p>
+      <w:pPr>
+        <w:pStyle w:val="ListBullet"/>
+      </w:pPr>
+      <w:r>
+        <w:t>Тактикам с целью (пешка или клетка) кнопка предлагает выбрать цель.</w:t>
+      </w:r>
+    </w:p>
+    <w:p>
+      <w:pPr>
+        <w:pStyle w:val="ListBullet"/>
+      </w:pPr>
+      <w:r>
+        <w:t>Платит Арканный голод.</w:t>
+      </w:r>
+    </w:p>
+    <w:p>
+      <w:pPr>
+        <w:pStyle w:val="Heading2"/>
+      </w:pPr>
+      <w:r>
+        <w:t>3.5. Сеть: 8 кругов и тень</w:t>
+      </w:r>
+    </w:p>
+    <w:p>
+      <w:r>
+        <w:t>Каждый путь — круг из 5 камней:</w:t>
+      </w:r>
+    </w:p>
+    <w:p>
+      <w:pPr>
+        <w:pStyle w:val="ListBullet"/>
+      </w:pPr>
+      <w:r>
+        <w:rPr>
+          <w:b/>
+        </w:rPr>
+        <w:t>вход</w:t>
+      </w:r>
+      <w:r>
+        <w:t xml:space="preserve"> смотрит к Песни и открыт всегда;</w:t>
+      </w:r>
+    </w:p>
+    <w:p>
+      <w:pPr>
+        <w:pStyle w:val="ListBullet"/>
+      </w:pPr>
+      <w:r>
+        <w:t xml:space="preserve">два </w:t>
+      </w:r>
+      <w:r>
+        <w:rPr>
+          <w:b/>
+        </w:rPr>
+        <w:t>боковых</w:t>
+      </w:r>
+      <w:r>
+        <w:t xml:space="preserve"> камня — мосты к соседним кругам;</w:t>
+      </w:r>
+    </w:p>
+    <w:p>
+      <w:pPr>
+        <w:pStyle w:val="ListBullet"/>
+      </w:pPr>
+      <w:r>
+        <w:rPr>
+          <w:b/>
+        </w:rPr>
+        <w:t>внешний</w:t>
+      </w:r>
+      <w:r>
+        <w:t xml:space="preserve"> камень лежит на тёмном кольце;</w:t>
+      </w:r>
+    </w:p>
+    <w:p>
+      <w:pPr>
+        <w:pStyle w:val="ListBullet"/>
+      </w:pPr>
+      <w:r>
+        <w:rPr>
+          <w:b/>
+        </w:rPr>
+        <w:t>вершина</w:t>
+      </w:r>
+      <w:r>
+        <w:t xml:space="preserve"> в центре круга, открывается при 3 открытых камнях круга.</w:t>
+      </w:r>
+    </w:p>
+    <w:p>
+      <w:r>
+        <w:t>Порядок кругов: Колыбельная → Сновидение → Культ → Воля → Пиршество → Шрамы → Обличья → Стая.</w:t>
+      </w:r>
+    </w:p>
+    <w:p>
+      <w:r>
+        <w:t xml:space="preserve">Каждый камень даёт </w:t>
+      </w:r>
+      <w:r>
+        <w:rPr>
+          <w:b/>
+        </w:rPr>
+        <w:t>активку и пассивку</w:t>
+      </w:r>
+      <w:r>
+        <w:t>. Всего 45 камней.</w:t>
+      </w:r>
+    </w:p>
+    <w:tbl>
+      <w:tblPr>
+        <w:tblStyle w:val="TableGrid"/>
+        <w:tblW w:type="auto" w:w="0"/>
+        <w:tblLook w:firstColumn="1" w:firstRow="1" w:lastColumn="0" w:lastRow="0" w:noHBand="0" w:noVBand="1" w:val="04A0"/>
+      </w:tblPr>
+      <w:tblGrid>
+        <w:gridCol w:w="1440"/>
+        <w:gridCol w:w="1440"/>
+        <w:gridCol w:w="1440"/>
+        <w:gridCol w:w="1440"/>
+        <w:gridCol w:w="1440"/>
+        <w:gridCol w:w="1440"/>
+      </w:tblGrid>
+      <w:tr>
+        <w:tc>
+          <w:tcPr>
+            <w:tcW w:type="dxa" w:w="1440"/>
+          </w:tcPr>
+          <w:p>
+            <w:r>
+              <w:rPr>
+                <w:b/>
+              </w:rPr>
+              <w:t>Путь</w:t>
+            </w:r>
+          </w:p>
+        </w:tc>
+        <w:tc>
+          <w:tcPr>
+            <w:tcW w:type="dxa" w:w="1440"/>
+          </w:tcPr>
+          <w:p>
+            <w:r>
+              <w:rPr>
+                <w:b/>
+              </w:rPr>
+              <w:t>1 вход</w:t>
+            </w:r>
+          </w:p>
+        </w:tc>
+        <w:tc>
+          <w:tcPr>
+            <w:tcW w:type="dxa" w:w="1440"/>
+          </w:tcPr>
+          <w:p>
+            <w:r>
+              <w:rPr>
+                <w:b/>
+              </w:rPr>
+              <w:t>2 бок</w:t>
+            </w:r>
+          </w:p>
+        </w:tc>
+        <w:tc>
+          <w:tcPr>
+            <w:tcW w:type="dxa" w:w="1440"/>
+          </w:tcPr>
+          <w:p>
+            <w:r>
+              <w:rPr>
+                <w:b/>
+              </w:rPr>
+              <w:t>3 бок</w:t>
+            </w:r>
+          </w:p>
+        </w:tc>
+        <w:tc>
+          <w:tcPr>
+            <w:tcW w:type="dxa" w:w="1440"/>
+          </w:tcPr>
+          <w:p>
+            <w:r>
+              <w:rPr>
+                <w:b/>
+              </w:rPr>
+              <w:t>4 внешний</w:t>
+            </w:r>
+          </w:p>
+        </w:tc>
+        <w:tc>
+          <w:tcPr>
+            <w:tcW w:type="dxa" w:w="1440"/>
+          </w:tcPr>
+          <w:p>
+            <w:r>
+              <w:rPr>
+                <w:b/>
+              </w:rPr>
+              <w:t>5 вершина</w:t>
+            </w:r>
+          </w:p>
+        </w:tc>
+      </w:tr>
+      <w:tr>
+        <w:tc>
+          <w:tcPr>
+            <w:tcW w:type="dxa" w:w="1440"/>
+          </w:tcPr>
+          <w:p>
+            <w:r>
+              <w:rPr>
+                <w:b/>
+              </w:rPr>
+              <w:t>Колыбельная</w:t>
+            </w:r>
+          </w:p>
+        </w:tc>
+        <w:tc>
+          <w:tcPr>
+            <w:tcW w:type="dxa" w:w="1440"/>
+          </w:tcPr>
+          <w:p>
+            <w:r>
+              <w:t>Колыбельная / спящие рядом не просыпаются от шума</w:t>
+            </w:r>
+          </w:p>
+        </w:tc>
+        <w:tc>
+          <w:tcPr>
+            <w:tcW w:type="dxa" w:w="1440"/>
+          </w:tcPr>
+          <w:p>
+            <w:r>
+              <w:t>Тихая песнь / аура отдыха</w:t>
+            </w:r>
+          </w:p>
+        </w:tc>
+        <w:tc>
+          <w:tcPr>
+            <w:tcW w:type="dxa" w:w="1440"/>
+          </w:tcPr>
+          <w:p>
+            <w:r>
+              <w:t>Усмирить зверя / звери не нападают, приручение легче</w:t>
+            </w:r>
+          </w:p>
+        </w:tc>
+        <w:tc>
+          <w:tcPr>
+            <w:tcW w:type="dxa" w:w="1440"/>
+          </w:tcPr>
+          <w:p>
+            <w:r>
+              <w:t>Тяжёлые веки / её сон дольше</w:t>
+            </w:r>
+          </w:p>
+        </w:tc>
+        <w:tc>
+          <w:tcPr>
+            <w:tcW w:type="dxa" w:w="1440"/>
+          </w:tcPr>
+          <w:p>
+            <w:r>
+              <w:t>Колыбельная поля / проснувшиеся вялые</w:t>
+            </w:r>
+          </w:p>
+        </w:tc>
+      </w:tr>
+      <w:tr>
+        <w:tc>
+          <w:tcPr>
+            <w:tcW w:type="dxa" w:w="1440"/>
+          </w:tcPr>
+          <w:p>
+            <w:r>
+              <w:rPr>
+                <w:b/>
+              </w:rPr>
+              <w:t>Сновидение</w:t>
+            </w:r>
+          </w:p>
+        </w:tc>
+        <w:tc>
+          <w:tcPr>
+            <w:tcW w:type="dxa" w:w="1440"/>
+          </w:tcPr>
+          <w:p>
+            <w:r>
+              <w:t>Вход в сон / спящие слабее</w:t>
+            </w:r>
+          </w:p>
+        </w:tc>
+        <w:tc>
+          <w:tcPr>
+            <w:tcW w:type="dxa" w:w="1440"/>
+          </w:tcPr>
+          <w:p>
+            <w:r>
+              <w:t>Хождение во сне / ранение будит берсерком</w:t>
+            </w:r>
+          </w:p>
+        </w:tc>
+        <w:tc>
+          <w:tcPr>
+            <w:tcW w:type="dxa" w:w="1440"/>
+          </w:tcPr>
+          <w:p>
+            <w:r>
+              <w:t>Медленное пожирание (10 ночей) / кормит голод</w:t>
+            </w:r>
+          </w:p>
+        </w:tc>
+        <w:tc>
+          <w:tcPr>
+            <w:tcW w:type="dxa" w:w="1440"/>
+          </w:tcPr>
+          <w:p>
+            <w:r>
+              <w:t>Ночной приговор / обидчик судим ночью, спящие не видят сквозь вуаль</w:t>
+            </w:r>
+          </w:p>
+        </w:tc>
+        <w:tc>
+          <w:tcPr>
+            <w:tcW w:type="dxa" w:w="1440"/>
+          </w:tcPr>
+          <w:p>
+            <w:r>
+              <w:t>Спящая свита / +2 одновременных пожирания</w:t>
+            </w:r>
+          </w:p>
+        </w:tc>
+      </w:tr>
+      <w:tr>
+        <w:tc>
+          <w:tcPr>
+            <w:tcW w:type="dxa" w:w="1440"/>
+          </w:tcPr>
+          <w:p>
+            <w:r>
+              <w:rPr>
+                <w:b/>
+              </w:rPr>
+              <w:t>Культ</w:t>
+            </w:r>
+          </w:p>
+        </w:tc>
+        <w:tc>
+          <w:tcPr>
+            <w:tcW w:type="dxa" w:w="1440"/>
+          </w:tcPr>
+          <w:p>
+            <w:r>
+              <w:t>Посеять обожание / растёт каждую ночь</w:t>
+            </w:r>
+          </w:p>
+        </w:tc>
+        <w:tc>
+          <w:tcPr>
+            <w:tcW w:type="dxa" w:w="1440"/>
+          </w:tcPr>
+          <w:p>
+            <w:r>
+              <w:t>Созвать паству / охраняют её ночью</w:t>
+            </w:r>
+          </w:p>
+        </w:tc>
+        <w:tc>
+          <w:tcPr>
+            <w:tcW w:type="dxa" w:w="1440"/>
+          </w:tcPr>
+          <w:p>
+            <w:r>
+              <w:t>Благословение / нападают на непокорных</w:t>
+            </w:r>
+          </w:p>
+        </w:tc>
+        <w:tc>
+          <w:tcPr>
+            <w:tcW w:type="dxa" w:w="1440"/>
+          </w:tcPr>
+          <w:p>
+            <w:r>
+              <w:t>Последний приказ / ярость растёт со стадией</w:t>
+            </w:r>
+          </w:p>
+        </w:tc>
+        <w:tc>
+          <w:tcPr>
+            <w:tcW w:type="dxa" w:w="1440"/>
+          </w:tcPr>
+          <w:p>
+            <w:r>
+              <w:t>Обращение / рост быстрее</w:t>
+            </w:r>
+          </w:p>
+        </w:tc>
+      </w:tr>
+      <w:tr>
+        <w:tc>
+          <w:tcPr>
+            <w:tcW w:type="dxa" w:w="1440"/>
+          </w:tcPr>
+          <w:p>
+            <w:r>
+              <w:rPr>
+                <w:b/>
+              </w:rPr>
+              <w:t>Воля</w:t>
+            </w:r>
+          </w:p>
+        </w:tc>
+        <w:tc>
+          <w:tcPr>
+            <w:tcW w:type="dxa" w:w="1440"/>
+          </w:tcPr>
+          <w:p>
+            <w:r>
+              <w:t>Зов / позванный не может ранить</w:t>
+            </w:r>
+          </w:p>
+        </w:tc>
+        <w:tc>
+          <w:tcPr>
+            <w:tcW w:type="dxa" w:w="1440"/>
+          </w:tcPr>
+          <w:p>
+            <w:r>
+              <w:t>Ложный приказ / убеждение и вербовка</w:t>
+            </w:r>
+          </w:p>
+        </w:tc>
+        <w:tc>
+          <w:tcPr>
+            <w:tcW w:type="dxa" w:w="1440"/>
+          </w:tcPr>
+          <w:p>
+            <w:r>
+              <w:t>Раздор / Зов и сон ложатся легче</w:t>
+            </w:r>
+          </w:p>
+        </w:tc>
+        <w:tc>
+          <w:tcPr>
+            <w:tcW w:type="dxa" w:w="1440"/>
+          </w:tcPr>
+          <w:p>
+            <w:r>
+              <w:t>Пленение / дольше</w:t>
+            </w:r>
+          </w:p>
+        </w:tc>
+        <w:tc>
+          <w:tcPr>
+            <w:tcW w:type="dxa" w:w="1440"/>
+          </w:tcPr>
+          <w:p>
+            <w:r>
+              <w:t>Обратить рейд / Зов дальше и больше</w:t>
+            </w:r>
+          </w:p>
+        </w:tc>
+      </w:tr>
+      <w:tr>
+        <w:tc>
+          <w:tcPr>
+            <w:tcW w:type="dxa" w:w="1440"/>
+          </w:tcPr>
+          <w:p>
+            <w:r>
+              <w:rPr>
+                <w:b/>
+              </w:rPr>
+              <w:t>Пиршество</w:t>
+            </w:r>
+          </w:p>
+        </w:tc>
+        <w:tc>
+          <w:tcPr>
+            <w:tcW w:type="dxa" w:w="1440"/>
+          </w:tcPr>
+          <w:p>
+            <w:r>
+              <w:t>Голос Мертвеца / голоса усиливают Песнь</w:t>
+            </w:r>
+          </w:p>
+        </w:tc>
+        <w:tc>
+          <w:tcPr>
+            <w:tcW w:type="dxa" w:w="1440"/>
+          </w:tcPr>
+          <w:p>
+            <w:r>
+              <w:t>Глоток / пожирание лечит</w:t>
+            </w:r>
+          </w:p>
+        </w:tc>
+        <w:tc>
+          <w:tcPr>
+            <w:tcW w:type="dxa" w:w="1440"/>
+          </w:tcPr>
+          <w:p>
+            <w:r>
+              <w:t>Выпустить запас / запас сущности</w:t>
+            </w:r>
+          </w:p>
+        </w:tc>
+        <w:tc>
+          <w:tcPr>
+            <w:tcW w:type="dxa" w:w="1440"/>
+          </w:tcPr>
+          <w:p>
+            <w:r>
+              <w:t>Чужой голос / редкие голоса ценнее</w:t>
+            </w:r>
+          </w:p>
+        </w:tc>
+        <w:tc>
+          <w:tcPr>
+            <w:tcW w:type="dxa" w:w="1440"/>
+          </w:tcPr>
+          <w:p>
+            <w:r>
+              <w:t>Крик коллекции / каждый голос сильнее</w:t>
+            </w:r>
+          </w:p>
+        </w:tc>
+      </w:tr>
+      <w:tr>
+        <w:tc>
+          <w:tcPr>
+            <w:tcW w:type="dxa" w:w="1440"/>
+          </w:tcPr>
+          <w:p>
+            <w:r>
+              <w:rPr>
+                <w:b/>
+              </w:rPr>
+              <w:t>Шрамы</w:t>
+            </w:r>
+          </w:p>
+        </w:tc>
+        <w:tc>
+          <w:tcPr>
+            <w:tcW w:type="dxa" w:w="1440"/>
+          </w:tcPr>
+          <w:p>
+            <w:r>
+              <w:t>Снять шрам / удары оставляют шрамы</w:t>
+            </w:r>
+          </w:p>
+        </w:tc>
+        <w:tc>
+          <w:tcPr>
+            <w:tcW w:type="dxa" w:w="1440"/>
+          </w:tcPr>
+          <w:p>
+            <w:r>
+              <w:t>Почуять меченых / чувствует сквозь стены</w:t>
+            </w:r>
+          </w:p>
+        </w:tc>
+        <w:tc>
+          <w:tcPr>
+            <w:tcW w:type="dxa" w:w="1440"/>
+          </w:tcPr>
+          <w:p>
+            <w:r>
+              <w:t>Ужас / враги рядом бьют хуже</w:t>
+            </w:r>
+          </w:p>
+        </w:tc>
+        <w:tc>
+          <w:tcPr>
+            <w:tcW w:type="dxa" w:w="1440"/>
+          </w:tcPr>
+          <w:p>
+            <w:r>
+              <w:t>Струна / меченые сопротивляются слабее</w:t>
+            </w:r>
+          </w:p>
+        </w:tc>
+        <w:tc>
+          <w:tcPr>
+            <w:tcW w:type="dxa" w:w="1440"/>
+          </w:tcPr>
+          <w:p>
+            <w:r>
+              <w:t>Вскрыть шрамы / шрамы больнее</w:t>
+            </w:r>
+          </w:p>
+        </w:tc>
+      </w:tr>
+      <w:tr>
+        <w:tc>
+          <w:tcPr>
+            <w:tcW w:type="dxa" w:w="1440"/>
+          </w:tcPr>
+          <w:p>
+            <w:r>
+              <w:rPr>
+                <w:b/>
+              </w:rPr>
+              <w:t>Обличья</w:t>
+            </w:r>
+          </w:p>
+        </w:tc>
+        <w:tc>
+          <w:tcPr>
+            <w:tcW w:type="dxa" w:w="1440"/>
+          </w:tcPr>
+          <w:p>
+            <w:r>
+              <w:t>Вуаль / вдвое дольше</w:t>
+            </w:r>
+          </w:p>
+        </w:tc>
+        <w:tc>
+          <w:tcPr>
+            <w:tcW w:type="dxa" w:w="1440"/>
+          </w:tcPr>
+          <w:p>
+            <w:r>
+              <w:t>Олениха и ворона / в облике не цель</w:t>
+            </w:r>
+          </w:p>
+        </w:tc>
+        <w:tc>
+          <w:tcPr>
+            <w:tcW w:type="dxa" w:w="1440"/>
+          </w:tcPr>
+          <w:p>
+            <w:r>
+              <w:t>Мираж / враги рядом мажут</w:t>
+            </w:r>
+          </w:p>
+        </w:tc>
+        <w:tc>
+          <w:tcPr>
+            <w:tcW w:type="dxa" w:w="1440"/>
+          </w:tcPr>
+          <w:p>
+            <w:r>
+              <w:t>Подмена / двойник раз в час</w:t>
+            </w:r>
+          </w:p>
+        </w:tc>
+        <w:tc>
+          <w:tcPr>
+            <w:tcW w:type="dxa" w:w="1440"/>
+          </w:tcPr>
+          <w:p>
+            <w:r>
+              <w:t>Вуаль стаи / вуаль и облики бесплатны, раскрывают вдвое реже</w:t>
+            </w:r>
+          </w:p>
+        </w:tc>
+      </w:tr>
+      <w:tr>
+        <w:tc>
+          <w:tcPr>
+            <w:tcW w:type="dxa" w:w="1440"/>
+          </w:tcPr>
+          <w:p>
+            <w:r>
+              <w:rPr>
+                <w:b/>
+              </w:rPr>
+              <w:t>Стая</w:t>
+            </w:r>
+          </w:p>
+        </w:tc>
+        <w:tc>
+          <w:tcPr>
+            <w:tcW w:type="dxa" w:w="1440"/>
+          </w:tcPr>
+          <w:p>
+            <w:r>
+              <w:t>Стая / звери её не боятся</w:t>
+            </w:r>
+          </w:p>
+        </w:tc>
+        <w:tc>
+          <w:tcPr>
+            <w:tcW w:type="dxa" w:w="1440"/>
+          </w:tcPr>
+          <w:p>
+            <w:r>
+              <w:t>Охота песней / дичь приходит сама</w:t>
+            </w:r>
+          </w:p>
+        </w:tc>
+        <w:tc>
+          <w:tcPr>
+            <w:tcW w:type="dxa" w:w="1440"/>
+          </w:tcPr>
+          <w:p>
+            <w:r>
+              <w:t>Облик волчицы / звери рядом сильнее</w:t>
+            </w:r>
+          </w:p>
+        </w:tc>
+        <w:tc>
+          <w:tcPr>
+            <w:tcW w:type="dxa" w:w="1440"/>
+          </w:tcPr>
+          <w:p>
+            <w:r>
+              <w:t>Позвать хищника / Охота берёт крупных</w:t>
+            </w:r>
+          </w:p>
+        </w:tc>
+        <w:tc>
+          <w:tcPr>
+            <w:tcW w:type="dxa" w:w="1440"/>
+          </w:tcPr>
+          <w:p>
+            <w:r>
+              <w:t>Звери против рейда / стая дольше и дальше</w:t>
+            </w:r>
+          </w:p>
+        </w:tc>
+      </w:tr>
+    </w:tbl>
+    <w:p>
+      <w:pPr>
+        <w:pStyle w:val="Heading2"/>
+      </w:pPr>
+      <w:r>
+        <w:t>3.6. В тени потока (секретный путь)</w:t>
+      </w:r>
+    </w:p>
+    <w:p>
+      <w:pPr>
+        <w:pStyle w:val="ListBullet"/>
+      </w:pPr>
+      <w:r>
+        <w:rPr>
+          <w:b/>
+        </w:rPr>
+        <w:t>Открытие:</w:t>
       </w:r>
     </w:p>
     <w:p>
@@ -938,7 +1715,7 @@
         <w:pStyle w:val="ListBullet2"/>
       </w:pPr>
       <w:r>
-        <w:t>пешки с нулевой чувствительностью — сразу;</w:t>
+        <w:t>ритуал, который Вестница ведёт в бурном потоке (с шансом);</w:t>
       </w:r>
     </w:p>
     <w:p>
@@ -946,36 +1723,21 @@
         <w:pStyle w:val="ListBullet2"/>
       </w:pPr>
       <w:r>
-        <w:t>пешки с низкой чувствительностью — с шансом, тем выше, чем глуше пешка;</w:t>
+        <w:t>или редкая черта Арканной Зависимости (3% у рождённых Вестниц).</w:t>
       </w:r>
     </w:p>
     <w:p>
       <w:pPr>
-        <w:pStyle w:val="ListBullet2"/>
+        <w:pStyle w:val="ListBullet"/>
       </w:pPr>
       <w:r>
-        <w:t>турели и механоиды — всегда;</w:t>
+        <w:rPr>
+          <w:b/>
+        </w:rPr>
+        <w:t>Интерфейс:</w:t>
       </w:r>
-    </w:p>
-    <w:p>
-      <w:pPr>
-        <w:pStyle w:val="ListBullet2"/>
-      </w:pPr>
       <w:r>
-        <w:t>охотницы с «чутьём хищника».</w:t>
-      </w:r>
-    </w:p>
-    <w:p>
-      <w:pPr>
-        <w:pStyle w:val="Heading2"/>
-      </w:pPr>
-      <w:r>
-        <w:t>3.4. Тактики охоты</w:t>
-      </w:r>
-    </w:p>
-    <w:p>
-      <w:r>
-        <w:t>Одна кнопка. Текущая тактика выбирается в меню. Пресет — набор тактик, которые переключаются по кругу. Игрок может собирать свои пресеты. Платит Арканным голодом.</w:t>
+        <w:t xml:space="preserve"> когда тень открыта, лист темнеет, проявляется тёмное кольцо, а в центре вместо «Песни» стоит «Поток».</w:t>
       </w:r>
     </w:p>
     <w:tbl>
@@ -998,7 +1760,7 @@
               <w:rPr>
                 <w:b/>
               </w:rPr>
-              <w:t>Тактика</w:t>
+              <w:t>Камень</w:t>
             </w:r>
           </w:p>
         </w:tc>
@@ -1011,7 +1773,7 @@
               <w:rPr>
                 <w:b/>
               </w:rPr>
-              <w:t>Действие</w:t>
+              <w:t>Активка / пассивка</w:t>
             </w:r>
           </w:p>
         </w:tc>
@@ -1023,7 +1785,7 @@
           </w:tcPr>
           <w:p>
             <w:r>
-              <w:t>Вуаль</w:t>
+              <w:t>Шаг в тень</w:t>
             </w:r>
           </w:p>
         </w:tc>
@@ -1033,7 +1795,7 @@
           </w:tcPr>
           <w:p>
             <w:r>
-              <w:t>уйти в невидимость</w:t>
+              <w:t>перенос в любое тёмное место / сила растёт от потока, голод тает быстрее</w:t>
             </w:r>
           </w:p>
         </w:tc>
@@ -1045,7 +1807,7 @@
           </w:tcPr>
           <w:p>
             <w:r>
-              <w:t>Облик: ворона / олениха / волчица</w:t>
+              <w:t>Кража лет</w:t>
             </w:r>
           </w:p>
         </w:tc>
@@ -1055,7 +1817,7 @@
           </w:tcPr>
           <w:p>
             <w:r>
-              <w:t>смена облика (раздел 1)</w:t>
+              <w:t>жертва стареет на 5 лет, она молодеет и лечится / пожирание молодит</w:t>
             </w:r>
           </w:p>
         </w:tc>
@@ -1067,7 +1829,7 @@
           </w:tcPr>
           <w:p>
             <w:r>
-              <w:t>Зов</w:t>
+              <w:t>Искажение времени</w:t>
             </w:r>
           </w:p>
         </w:tc>
@@ -1077,16 +1839,7 @@
           </w:tcPr>
           <w:p>
             <w:r>
-              <w:t xml:space="preserve">враги в радиусе прекращают бой и идут к ней. Пока они в Зове, они </w:t>
-            </w:r>
-            <w:r>
-              <w:rPr>
-                <w:b/>
-              </w:rPr>
-              <w:t>не могут причинить ей вред</w:t>
-            </w:r>
-            <w:r>
-              <w:t>, а она применяет к ним Похищение эссенции (у Вестниц 100%)</w:t>
+              <w:t>враги медленнее, свои быстрее / вокруг неё враги всегда чуть медленнее</w:t>
             </w:r>
           </w:p>
         </w:tc>
@@ -1098,7 +1851,7 @@
           </w:tcPr>
           <w:p>
             <w:r>
-              <w:t>Колыбельная</w:t>
+              <w:t>Туман и вспышка</w:t>
             </w:r>
           </w:p>
         </w:tc>
@@ -1108,7 +1861,7 @@
           </w:tcPr>
           <w:p>
             <w:r>
-              <w:t>часть врагов засыпает</w:t>
+              <w:t>чёрный туман вокруг и вспышка до рассвета, у своей — по выбору / у враждебной: туман днём, свет гаснет каждую ночь</w:t>
             </w:r>
           </w:p>
         </w:tc>
@@ -1120,7 +1873,10 @@
           </w:tcPr>
           <w:p>
             <w:r>
-              <w:t>Раздор</w:t>
+              <w:rPr>
+                <w:b/>
+              </w:rPr>
+              <w:t>Вечная ночь (центр)</w:t>
             </w:r>
           </w:p>
         </w:tc>
@@ -1130,117 +1886,7 @@
           </w:tcPr>
           <w:p>
             <w:r>
-              <w:t>враги слышат голоса своих и бьют друг друга — рейд против самого себя</w:t>
-            </w:r>
-          </w:p>
-        </w:tc>
-      </w:tr>
-      <w:tr>
-        <w:tc>
-          <w:tcPr>
-            <w:tcW w:type="dxa" w:w="4320"/>
-          </w:tcPr>
-          <w:p>
-            <w:r>
-              <w:t>Стая</w:t>
-            </w:r>
-          </w:p>
-        </w:tc>
-        <w:tc>
-          <w:tcPr>
-            <w:tcW w:type="dxa" w:w="4320"/>
-          </w:tcPr>
-          <w:p>
-            <w:r>
-              <w:t>дикие звери карты идут на рейд и бьют только рейдеров</w:t>
-            </w:r>
-          </w:p>
-        </w:tc>
-      </w:tr>
-      <w:tr>
-        <w:tc>
-          <w:tcPr>
-            <w:tcW w:type="dxa" w:w="4320"/>
-          </w:tcPr>
-          <w:p>
-            <w:r>
-              <w:t>Пленение песней</w:t>
-            </w:r>
-          </w:p>
-        </w:tc>
-        <w:tc>
-          <w:tcPr>
-            <w:tcW w:type="dxa" w:w="4320"/>
-          </w:tcPr>
-          <w:p>
-            <w:r>
-              <w:t>несколько врагов временно на её стороне, боль 0%; по окончании засыпают (можно взять в плен)</w:t>
-            </w:r>
-          </w:p>
-        </w:tc>
-      </w:tr>
-      <w:tr>
-        <w:tc>
-          <w:tcPr>
-            <w:tcW w:type="dxa" w:w="4320"/>
-          </w:tcPr>
-          <w:p>
-            <w:r>
-              <w:t>Ложная цель</w:t>
-            </w:r>
-          </w:p>
-        </w:tc>
-        <w:tc>
-          <w:tcPr>
-            <w:tcW w:type="dxa" w:w="4320"/>
-          </w:tcPr>
-          <w:p>
-            <w:r>
-              <w:t>иллюзорные двойники колонистов тянут огонь на себя</w:t>
-            </w:r>
-          </w:p>
-        </w:tc>
-      </w:tr>
-      <w:tr>
-        <w:tc>
-          <w:tcPr>
-            <w:tcW w:type="dxa" w:w="4320"/>
-          </w:tcPr>
-          <w:p>
-            <w:r>
-              <w:t>Вуаль стаи</w:t>
-            </w:r>
-          </w:p>
-        </w:tc>
-        <w:tc>
-          <w:tcPr>
-            <w:tcW w:type="dxa" w:w="4320"/>
-          </w:tcPr>
-          <w:p>
-            <w:r>
-              <w:t>свои в радиусе невидимы ненадолго</w:t>
-            </w:r>
-          </w:p>
-        </w:tc>
-      </w:tr>
-      <w:tr>
-        <w:tc>
-          <w:tcPr>
-            <w:tcW w:type="dxa" w:w="4320"/>
-          </w:tcPr>
-          <w:p>
-            <w:r>
-              <w:t>Охота песней</w:t>
-            </w:r>
-          </w:p>
-        </w:tc>
-        <w:tc>
-          <w:tcPr>
-            <w:tcW w:type="dxa" w:w="4320"/>
-          </w:tcPr>
-          <w:p>
-            <w:r>
-              <w:t>зверь, отмеченный для охоты, сам идёт к колонии и умирает, как отданный на убой; размер зверя — против силы Вестницы. Работает пассивно, кнопкой можно ускорить</w:t>
+              <w:t>3 дня иллюзорной ночи / ночью Песнь сильнее</w:t>
             </w:r>
           </w:p>
         </w:tc>
@@ -1248,62 +1894,13 @@
     </w:tbl>
     <w:p>
       <w:r>
-        <w:t>Пример пресетов:</w:t>
-      </w:r>
-    </w:p>
-    <w:p>
-      <w:pPr>
-        <w:pStyle w:val="ListBullet"/>
-      </w:pPr>
-      <w:r>
         <w:rPr>
           <w:b/>
         </w:rPr>
-        <w:t>«Засада»:</w:t>
+        <w:t>Синергии.</w:t>
       </w:r>
       <w:r>
-        <w:t xml:space="preserve"> Вуаль стаи → Зов → Колыбельная.</w:t>
-      </w:r>
-    </w:p>
-    <w:p>
-      <w:pPr>
-        <w:pStyle w:val="ListBullet"/>
-      </w:pPr>
-      <w:r>
-        <w:rPr>
-          <w:b/>
-        </w:rPr>
-        <w:t>«Жатва»:</w:t>
-      </w:r>
-      <w:r>
-        <w:t xml:space="preserve"> Стая → Раздор.</w:t>
-      </w:r>
-    </w:p>
-    <w:p>
-      <w:pPr>
-        <w:pStyle w:val="ListBullet"/>
-      </w:pPr>
-      <w:r>
-        <w:rPr>
-          <w:b/>
-        </w:rPr>
-        <w:t>«Пленение»:</w:t>
-      </w:r>
-      <w:r>
-        <w:t xml:space="preserve"> Колыбельная → Пленение песней.</w:t>
-      </w:r>
-    </w:p>
-    <w:p>
-      <w:pPr>
-        <w:pStyle w:val="Heading2"/>
-      </w:pPr>
-      <w:r>
-        <w:t>3.5. Сеть развития</w:t>
-      </w:r>
-    </w:p>
-    <w:p>
-      <w:r>
-        <w:t>Нелинейная: узлы в восьми областях, связанные между собой. Открыть можно любой узел рядом с открытым. Ограничения мягкие: сильнейшие узлы требуют уровня Песни, а не ветки. Раз артефактов у Вестницы нет, сеть шире, чем у других (около 50 узлов).</w:t>
+        <w:t xml:space="preserve"> Когда тень открыта, внешний камень каждого круга даёт свою тёмную сторону:</w:t>
       </w:r>
     </w:p>
     <w:tbl>
@@ -1326,7 +1923,7 @@
               <w:rPr>
                 <w:b/>
               </w:rPr>
-              <w:t>Область</w:t>
+              <w:t>Путь</w:t>
             </w:r>
           </w:p>
         </w:tc>
@@ -1339,7 +1936,7 @@
               <w:rPr>
                 <w:b/>
               </w:rPr>
-              <w:t>Что в ней растёт</w:t>
+              <w:t>Тёмная сторона</w:t>
             </w:r>
           </w:p>
         </w:tc>
@@ -1361,7 +1958,7 @@
           </w:tcPr>
           <w:p>
             <w:r>
-              <w:t>сон, покой, отдых своих, смирение зверей</w:t>
+              <w:t>Безвременье: усыплённые тяжёлыми веками выпадают из времени</w:t>
             </w:r>
           </w:p>
         </w:tc>
@@ -1373,7 +1970,7 @@
           </w:tcPr>
           <w:p>
             <w:r>
-              <w:t>Голоса</w:t>
+              <w:t>Сновидение</w:t>
             </w:r>
           </w:p>
         </w:tc>
@@ -1383,7 +1980,7 @@
           </w:tcPr>
           <w:p>
             <w:r>
-              <w:t>подражание, раздор, ложные приказы, двойной голос</w:t>
+              <w:t>Сон длиннее жизни: медленное пожирание старит</w:t>
             </w:r>
           </w:p>
         </w:tc>
@@ -1395,7 +1992,7 @@
           </w:tcPr>
           <w:p>
             <w:r>
-              <w:t>Власть</w:t>
+              <w:t>Культ</w:t>
             </w:r>
           </w:p>
         </w:tc>
@@ -1405,7 +2002,95 @@
           </w:tcPr>
           <w:p>
             <w:r>
-              <w:t>Зов, пленение, длительность и число целей</w:t>
+              <w:t>Чёрная месса: культисты кормят её голод</w:t>
+            </w:r>
+          </w:p>
+        </w:tc>
+      </w:tr>
+      <w:tr>
+        <w:tc>
+          <w:tcPr>
+            <w:tcW w:type="dxa" w:w="4320"/>
+          </w:tcPr>
+          <w:p>
+            <w:r>
+              <w:t>Воля</w:t>
+            </w:r>
+          </w:p>
+        </w:tc>
+        <w:tc>
+          <w:tcPr>
+            <w:tcW w:type="dxa" w:w="4320"/>
+          </w:tcPr>
+          <w:p>
+            <w:r>
+              <w:t>Зов сквозь тьму: позванный из темноты проваливается к ней</w:t>
+            </w:r>
+          </w:p>
+        </w:tc>
+      </w:tr>
+      <w:tr>
+        <w:tc>
+          <w:tcPr>
+            <w:tcW w:type="dxa" w:w="4320"/>
+          </w:tcPr>
+          <w:p>
+            <w:r>
+              <w:t>Пиршество</w:t>
+            </w:r>
+          </w:p>
+        </w:tc>
+        <w:tc>
+          <w:tcPr>
+            <w:tcW w:type="dxa" w:w="4320"/>
+          </w:tcPr>
+          <w:p>
+            <w:r>
+              <w:t>Голоса прошлого: каждый голос молодит</w:t>
+            </w:r>
+          </w:p>
+        </w:tc>
+      </w:tr>
+      <w:tr>
+        <w:tc>
+          <w:tcPr>
+            <w:tcW w:type="dxa" w:w="4320"/>
+          </w:tcPr>
+          <w:p>
+            <w:r>
+              <w:t>Шрамы</w:t>
+            </w:r>
+          </w:p>
+        </w:tc>
+        <w:tc>
+          <w:tcPr>
+            <w:tcW w:type="dxa" w:w="4320"/>
+          </w:tcPr>
+          <w:p>
+            <w:r>
+              <w:t>Болезни разума: деменция и Альцгеймер у меченых</w:t>
+            </w:r>
+          </w:p>
+        </w:tc>
+      </w:tr>
+      <w:tr>
+        <w:tc>
+          <w:tcPr>
+            <w:tcW w:type="dxa" w:w="4320"/>
+          </w:tcPr>
+          <w:p>
+            <w:r>
+              <w:t>Обличья</w:t>
+            </w:r>
+          </w:p>
+        </w:tc>
+        <w:tc>
+          <w:tcPr>
+            <w:tcW w:type="dxa" w:w="4320"/>
+          </w:tcPr>
+          <w:p>
+            <w:r>
+              <w:t>Тёмный облик: в облике в темноте её не раскрыть</w:t>
             </w:r>
           </w:p>
         </w:tc>
@@ -1427,95 +2112,7 @@
           </w:tcPr>
           <w:p>
             <w:r>
-              <w:t>звери карты, Охота песней, облик волчицы</w:t>
-            </w:r>
-          </w:p>
-        </w:tc>
-      </w:tr>
-      <w:tr>
-        <w:tc>
-          <w:tcPr>
-            <w:tcW w:type="dxa" w:w="4320"/>
-          </w:tcPr>
-          <w:p>
-            <w:r>
-              <w:t>Иллюзии</w:t>
-            </w:r>
-          </w:p>
-        </w:tc>
-        <w:tc>
-          <w:tcPr>
-            <w:tcW w:type="dxa" w:w="4320"/>
-          </w:tcPr>
-          <w:p>
-            <w:r>
-              <w:t>двойники, миражи стен и проходов, ложные цели</w:t>
-            </w:r>
-          </w:p>
-        </w:tc>
-      </w:tr>
-      <w:tr>
-        <w:tc>
-          <w:tcPr>
-            <w:tcW w:type="dxa" w:w="4320"/>
-          </w:tcPr>
-          <w:p>
-            <w:r>
-              <w:t>Вуаль и облик</w:t>
-            </w:r>
-          </w:p>
-        </w:tc>
-        <w:tc>
-          <w:tcPr>
-            <w:tcW w:type="dxa" w:w="4320"/>
-          </w:tcPr>
-          <w:p>
-            <w:r>
-              <w:t>вуаль, облики вороны и оленихи, маскировка</w:t>
-            </w:r>
-          </w:p>
-        </w:tc>
-      </w:tr>
-      <w:tr>
-        <w:tc>
-          <w:tcPr>
-            <w:tcW w:type="dxa" w:w="4320"/>
-          </w:tcPr>
-          <w:p>
-            <w:r>
-              <w:t>Шрамы</w:t>
-            </w:r>
-          </w:p>
-        </w:tc>
-        <w:tc>
-          <w:tcPr>
-            <w:tcW w:type="dxa" w:w="4320"/>
-          </w:tcPr>
-          <w:p>
-            <w:r>
-              <w:t>фантомные шрамы (заживают, боль остаётся), страх</w:t>
-            </w:r>
-          </w:p>
-        </w:tc>
-      </w:tr>
-      <w:tr>
-        <w:tc>
-          <w:tcPr>
-            <w:tcW w:type="dxa" w:w="4320"/>
-          </w:tcPr>
-          <w:p>
-            <w:r>
-              <w:t>Ритуал</w:t>
-            </w:r>
-          </w:p>
-        </w:tc>
-        <w:tc>
-          <w:tcPr>
-            <w:tcW w:type="dxa" w:w="4320"/>
-          </w:tcPr>
-          <w:p>
-            <w:r>
-              <w:t>самообладание и энергия в ритуалистике</w:t>
+              <w:t>Звери из тени: хищники встают из темноты по двое-трое</w:t>
             </w:r>
           </w:p>
         </w:tc>
@@ -1523,7 +2120,10 @@
     </w:tbl>
     <w:p>
       <w:r>
-        <w:t>Узлы на стыках двух областей — самые интересные. Например:</w:t>
+        <w:rPr>
+          <w:b/>
+        </w:rPr>
+        <w:t>Чёрный туман:</w:t>
       </w:r>
     </w:p>
     <w:p>
@@ -1531,7 +2131,7 @@
         <w:pStyle w:val="ListBullet"/>
       </w:pPr>
       <w:r>
-        <w:t>«Стая + Голоса»: звери слышат её голосом своего вожака;</w:t>
+        <w:t>ползёт по клеткам и проникает в здания через открытые двери;</w:t>
       </w:r>
     </w:p>
     <w:p>
@@ -1539,12 +2139,55 @@
         <w:pStyle w:val="ListBullet"/>
       </w:pPr>
       <w:r>
-        <w:t>«Иллюзии + Вуаль»: двойник остаётся на месте, когда она уходит в вуаль.</w:t>
+        <w:t>в нём почти невозможно попасть;</w:t>
+      </w:r>
+    </w:p>
+    <w:p>
+      <w:pPr>
+        <w:pStyle w:val="ListBullet"/>
+      </w:pPr>
+      <w:r>
+        <w:t>растения в нём не растут.</w:t>
       </w:r>
     </w:p>
     <w:p>
       <w:r>
-        <w:t>Полный список узлов распишу следующим шагом, если сама схема подходит.</w:t>
+        <w:rPr>
+          <w:b/>
+        </w:rPr>
+        <w:t>Вечная ночь:</w:t>
+      </w:r>
+    </w:p>
+    <w:p>
+      <w:pPr>
+        <w:pStyle w:val="ListBullet"/>
+      </w:pPr>
+      <w:r>
+        <w:t>небо ночное ровно 3 дня;</w:t>
+      </w:r>
+    </w:p>
+    <w:p>
+      <w:pPr>
+        <w:pStyle w:val="ListBullet"/>
+      </w:pPr>
+      <w:r>
+        <w:t>солнце настоящее: растения цветут, солнечные панели работают;</w:t>
+      </w:r>
+    </w:p>
+    <w:p>
+      <w:pPr>
+        <w:pStyle w:val="ListBullet"/>
+      </w:pPr>
+      <w:r>
+        <w:t>обмануты только разумы;</w:t>
+      </w:r>
+    </w:p>
+    <w:p>
+      <w:pPr>
+        <w:pStyle w:val="ListBullet"/>
+      </w:pPr>
+      <w:r>
+        <w:t>глухой колонист замечает фальшь, и игроку приходит письмо «небо неправильное».</w:t>
       </w:r>
     </w:p>
     <w:p>
@@ -1552,7 +2195,134 @@
         <w:pStyle w:val="Heading2"/>
       </w:pPr>
       <w:r>
-        <w:t>3.6. Прочее</w:t>
+        <w:t>3.7. Лечение</w:t>
+      </w:r>
+    </w:p>
+    <w:p>
+      <w:r>
+        <w:t>Любая Вестница (правый клик по пешке) снимает:</w:t>
+      </w:r>
+    </w:p>
+    <w:p>
+      <w:pPr>
+        <w:pStyle w:val="ListBullet"/>
+      </w:pPr>
+      <w:r>
+        <w:t>фантомные шрамы, в том числе чужие;</w:t>
+      </w:r>
+    </w:p>
+    <w:p>
+      <w:pPr>
+        <w:pStyle w:val="ListBullet"/>
+      </w:pPr>
+      <w:r>
+        <w:t>деменцию и Альцгеймер.</w:t>
+      </w:r>
+    </w:p>
+    <w:p>
+      <w:pPr>
+        <w:pStyle w:val="Heading2"/>
+      </w:pPr>
+      <w:r>
+        <w:t>3.8. Скрытые Вестницы</w:t>
+      </w:r>
+    </w:p>
+    <w:p>
+      <w:pPr>
+        <w:pStyle w:val="ListBullet"/>
+      </w:pPr>
+      <w:r>
+        <w:rPr>
+          <w:b/>
+        </w:rPr>
+        <w:t>Дикая</w:t>
+      </w:r>
+      <w:r>
+        <w:t xml:space="preserve"> получает главный путь: Воля, Сновидение, Шрамы, Стая или Колыбельная.</w:t>
+      </w:r>
+    </w:p>
+    <w:p>
+      <w:pPr>
+        <w:pStyle w:val="ListBullet2"/>
+      </w:pPr>
+      <w:r>
+        <w:t>Сновидица не Зовёт, а медленно пожирает спящих колонистов.</w:t>
+      </w:r>
+    </w:p>
+    <w:p>
+      <w:pPr>
+        <w:pStyle w:val="ListBullet2"/>
+      </w:pPr>
+      <w:r>
+        <w:t>Если её ранить или раскрыть, её спящие ночью идут убивать обидчика.</w:t>
+      </w:r>
+    </w:p>
+    <w:p>
+      <w:pPr>
+        <w:pStyle w:val="ListBullet"/>
+      </w:pPr>
+      <w:r>
+        <w:rPr>
+          <w:b/>
+        </w:rPr>
+        <w:t>Прималистка</w:t>
+      </w:r>
+      <w:r>
+        <w:t xml:space="preserve"> получает главный путь: Культ, Воля или Стая. Культистка каждую ночь заражает обожанием 1–2 колонистов, а они встают охранять её и нападают на непокорных.</w:t>
+      </w:r>
+    </w:p>
+    <w:p>
+      <w:pPr>
+        <w:pStyle w:val="ListBullet"/>
+      </w:pPr>
+      <w:r>
+        <w:rPr>
+          <w:b/>
+        </w:rPr>
+        <w:t>Теневая</w:t>
+      </w:r>
+      <w:r>
+        <w:t xml:space="preserve"> — 7% у любой:</w:t>
+      </w:r>
+    </w:p>
+    <w:p>
+      <w:pPr>
+        <w:pStyle w:val="ListBullet2"/>
+      </w:pPr>
+      <w:r>
+        <w:t>туман днём;</w:t>
+      </w:r>
+    </w:p>
+    <w:p>
+      <w:pPr>
+        <w:pStyle w:val="ListBullet2"/>
+      </w:pPr>
+      <w:r>
+        <w:t>вспышка ночью;</w:t>
+      </w:r>
+    </w:p>
+    <w:p>
+      <w:pPr>
+        <w:pStyle w:val="ListBullet2"/>
+      </w:pPr>
+      <w:r>
+        <w:t>однажды Вечная ночь.</w:t>
+      </w:r>
+    </w:p>
+    <w:p>
+      <w:pPr>
+        <w:pStyle w:val="ListBullet"/>
+      </w:pPr>
+      <w:r>
+        <w:t>Медленное пожирание и обожание прекращаются после её смерти. Шрамы остаются, их снимает любая Вестница.</w:t>
+      </w:r>
+    </w:p>
+    <w:p>
+      <w:pPr>
+        <w:pStyle w:val="Heading2"/>
+      </w:pPr>
+      <w:r>
+        <w:t>3.9. Прочее</w:t>
       </w:r>
     </w:p>
     <w:p>
@@ -1608,7 +2378,7 @@
         <w:t>Ритуалистика:</w:t>
       </w:r>
       <w:r>
-        <w:t xml:space="preserve"> усилена.</w:t>
+        <w:t xml:space="preserve"> врождённый бонус — вторая пара крыльев даёт столько же, сколько первая; поток ровнее (риск ×0.8).</w:t>
       </w:r>
     </w:p>
     <w:p>
@@ -1651,6 +2421,20 @@
       </w:r>
       <w:r>
         <w:t xml:space="preserve"> столько же, сколько Авир.</w:t>
+      </w:r>
+    </w:p>
+    <w:p>
+      <w:pPr>
+        <w:pStyle w:val="ListBullet"/>
+      </w:pPr>
+      <w:r>
+        <w:rPr>
+          <w:b/>
+        </w:rPr>
+        <w:t>Промпты иконок</w:t>
+      </w:r>
+      <w:r>
+        <w:t xml:space="preserve"> — отдельный документ «Вестницы-иконки-промпты».</w:t>
       </w:r>
     </w:p>
     <w:sectPr>

</xml_diff>

<commit_message>
Herald design: three-view wing sheet prompt
Co-Authored-By: Claude Opus 5.5 <noreply@anthropic.com>
Claude-Session: https://claude.ai/code/session_01YCWNLtj9zFsogxZeNiDKcG
</commit_message>
<xml_diff>
--- a/Вестницы-дизайн.docx
+++ b/Вестницы-дизайн.docx
@@ -678,6 +678,75 @@
           <w:sz w:val="19"/>
         </w:rPr>
         <w:t>Redraw these exact wings in the same style, size, line weight and shading, keeping exactly the same view and composition. Add a second pair of feathered bird wings growing from beneath the existing pair: the lower pair is slightly longer and frames the upper pair like a second, larger outline of the same wing. Same white and light grey feathers, same thick black outline. Not insect or butterfly wings. Transparent background, nothing else.</w:t>
+      </w:r>
+    </w:p>
+    <w:p>
+      <w:r>
+        <w:rPr>
+          <w:b/>
+        </w:rPr>
+        <w:t>Вариант на 2 генерации: три ракурса одним листом.</w:t>
+      </w:r>
+      <w:r>
+        <w:t xml:space="preserve"> Прикрепи сразу три картинки одного состояния: </w:t>
+      </w:r>
+      <w:r>
+        <w:rPr>
+          <w:rFonts w:ascii="Consolas" w:hAnsi="Consolas"/>
+          <w:sz w:val="20"/>
+        </w:rPr>
+        <w:t>Wings_Folded_south</w:t>
+      </w:r>
+      <w:r>
+        <w:t xml:space="preserve">, </w:t>
+      </w:r>
+      <w:r>
+        <w:rPr>
+          <w:rFonts w:ascii="Consolas" w:hAnsi="Consolas"/>
+          <w:sz w:val="20"/>
+        </w:rPr>
+        <w:t>_east</w:t>
+      </w:r>
+      <w:r>
+        <w:t xml:space="preserve">, </w:t>
+      </w:r>
+      <w:r>
+        <w:rPr>
+          <w:rFonts w:ascii="Consolas" w:hAnsi="Consolas"/>
+          <w:sz w:val="20"/>
+        </w:rPr>
+        <w:t>_north</w:t>
+      </w:r>
+      <w:r>
+        <w:t xml:space="preserve">, а во второй раз — три </w:t>
+      </w:r>
+      <w:r>
+        <w:rPr>
+          <w:rFonts w:ascii="Consolas" w:hAnsi="Consolas"/>
+          <w:sz w:val="20"/>
+        </w:rPr>
+        <w:t>Wings_Spread_*</w:t>
+      </w:r>
+      <w:r>
+        <w:t>.</w:t>
+      </w:r>
+    </w:p>
+    <w:p>
+      <w:pPr>
+        <w:ind w:left="240"/>
+      </w:pPr>
+      <w:r>
+        <w:rPr>
+          <w:rFonts w:ascii="Consolas" w:hAnsi="Consolas"/>
+          <w:color w:val="202050"/>
+          <w:sz w:val="19"/>
+        </w:rPr>
+        <w:t>Redraw these three exact wing images as one sheet: one row, three views in this order - from the south (back of the wings facing the viewer), from the east (side, facing right), from the north (seen from the front). Keep each view exactly as in its reference: same style, size, line weight, shading and composition. To every view add a second pair of feathered bird wings growing from beneath the existing pair: the lower pair is slightly longer and frames the upper pair like a second, larger outline of the same wing, seen from the same angle. Same white and light grey feathers, same thick black outline. Not insect or butterfly wings. Each view alone in its own equal square cell with clear empty space between cells. Transparent background, no text, nothing else.</w:t>
+      </w:r>
+    </w:p>
+    <w:p>
+      <w:r>
+        <w:t>Если лист выйдет кривым (ракурсы перепутаны или пары крыльев не совпадают между видами), вернись к варианту по одной картинке выше.</w:t>
       </w:r>
     </w:p>
     <w:p>

</xml_diff>

<commit_message>
FIXES-ZN: Herald icons, three-layer beast forms tinted from her colours, a Herald's beauty in Avir eyes; beast and spread-wing prompts
Co-Authored-By: Claude Opus 5.5 <noreply@anthropic.com>
Claude-Session: https://claude.ai/code/session_01YCWNLtj9zFsogxZeNiDKcG
</commit_message>
<xml_diff>
--- a/Вестницы-дизайн.docx
+++ b/Вестницы-дизайн.docx
@@ -810,12 +810,70 @@
         <w:pStyle w:val="Heading2"/>
       </w:pPr>
       <w:r>
-        <w:t>2.4. Звериные облики (3 генерации)</w:t>
+        <w:t>2.4. Звериные облики (6 генераций: 3 рисунка и 3 маски)</w:t>
       </w:r>
     </w:p>
     <w:p>
       <w:r>
-        <w:t>Белые и серые; цвет даст маска (её сделаю сам). Если удобно, приложи скриншот такого зверя из игры как образец стиля.</w:t>
+        <w:t>Все три облика — всегда самки: олениха, ворона, волчица. Каждый рисунок — белый и серый, с отчётливой маской вокруг глаз. Окраску даёт игра в три слоя:</w:t>
+      </w:r>
+    </w:p>
+    <w:p>
+      <w:pPr>
+        <w:pStyle w:val="ListBullet"/>
+      </w:pPr>
+      <w:r>
+        <w:rPr>
+          <w:b/>
+        </w:rPr>
+        <w:t>маска у глаз</w:t>
+      </w:r>
+      <w:r>
+        <w:t xml:space="preserve"> — цвет крыльев Вестницы;</w:t>
+      </w:r>
+    </w:p>
+    <w:p>
+      <w:pPr>
+        <w:pStyle w:val="ListBullet"/>
+      </w:pPr>
+      <w:r>
+        <w:rPr>
+          <w:b/>
+        </w:rPr>
+        <w:t>шерсть или перья на груди</w:t>
+      </w:r>
+      <w:r>
+        <w:t xml:space="preserve"> — цвет её груди;</w:t>
+      </w:r>
+    </w:p>
+    <w:p>
+      <w:pPr>
+        <w:pStyle w:val="ListBullet"/>
+      </w:pPr>
+      <w:r>
+        <w:rPr>
+          <w:b/>
+        </w:rPr>
+        <w:t>всё остальное</w:t>
+      </w:r>
+      <w:r>
+        <w:t xml:space="preserve"> — цвет её тела.</w:t>
+      </w:r>
+    </w:p>
+    <w:p>
+      <w:r>
+        <w:t>Поэтому звери у всех Вестниц разные.</w:t>
+      </w:r>
+    </w:p>
+    <w:p>
+      <w:r>
+        <w:rPr>
+          <w:b/>
+        </w:rPr>
+        <w:t>Рисунок</w:t>
+      </w:r>
+      <w:r>
+        <w:t xml:space="preserve"> (одна генерация на зверя):</w:t>
       </w:r>
     </w:p>
     <w:p>
@@ -828,7 +886,7 @@
           <w:color w:val="202050"/>
           <w:sz w:val="19"/>
         </w:rPr>
-        <w:t>Three game textures of one animal in the exact style of RimWorld animals: flat hand-drawn shapes, soft grey shading, one thick dark outline, seen from slightly above, white and light grey only so it can be tinted later. One row, three views: from the south (facing the viewer), from the east (side, facing right), from the north (facing away). Each view alone in its own equal square cell with clear empty space between cells. The animal looks almost ordinary, only subtly too graceful and too beautiful for the wild. Transparent background, no text, no shadow.</w:t>
+        <w:t>Three game textures of one female animal in the exact style of RimWorld animals: flat hand-drawn shapes, soft grey shading, one thick dark outline, seen from slightly above, white and light grey only so it can be tinted later. She has a distinct mask of slightly different feathers or fur around the eyes, and a clearly separate patch of lighter fur on the chest and throat. One row, three views: from the south (facing the viewer), from the east (side, facing right), from the north (facing away). Each view alone in its own equal square cell with clear empty space between cells. The animal looks almost ordinary, only subtly too graceful and too beautiful for the wild. Transparent background, no text, no shadow.</w:t>
         <w:br/>
       </w:r>
       <w:r>
@@ -837,7 +895,72 @@
           <w:color w:val="202050"/>
           <w:sz w:val="19"/>
         </w:rPr>
-        <w:t>The animal: [a crow / a slender doe / a she-wolf].</w:t>
+        <w:t>The animal: [a female crow / a slender doe / a she-wolf].</w:t>
+      </w:r>
+    </w:p>
+    <w:p>
+      <w:r>
+        <w:rPr>
+          <w:b/>
+        </w:rPr>
+        <w:t>Маска</w:t>
+      </w:r>
+      <w:r>
+        <w:t xml:space="preserve"> (прикрепи получившийся рисунок):</w:t>
+      </w:r>
+    </w:p>
+    <w:p>
+      <w:pPr>
+        <w:ind w:left="240"/>
+      </w:pPr>
+      <w:r>
+        <w:rPr>
+          <w:rFonts w:ascii="Consolas" w:hAnsi="Consolas"/>
+          <w:color w:val="202050"/>
+          <w:sz w:val="19"/>
+        </w:rPr>
+        <w:t>Make a flat colour map of this exact image, same size and same positions, no shading, no outline, no texture: paint the mask around the eyes pure red (255,0,0), the chest and throat patch pure green (0,255,0), and the whole rest of the animal pure blue (0,0,255). Transparent background everywhere else. Nothing else.</w:t>
+      </w:r>
+    </w:p>
+    <w:p>
+      <w:r>
+        <w:t>Дальше я сам режу рисунок по маске на три слоя.</w:t>
+      </w:r>
+    </w:p>
+    <w:p>
+      <w:pPr>
+        <w:pStyle w:val="Heading2"/>
+      </w:pPr>
+      <w:r>
+        <w:t>2.5. Раскрытые крылья сбоку (варианты)</w:t>
+      </w:r>
+    </w:p>
+    <w:p>
+      <w:r>
+        <w:t>Прикрепи две картинки: раскрытый крест (вид сзади) и сложенные крылья сбоку (</w:t>
+      </w:r>
+      <w:r>
+        <w:rPr>
+          <w:rFonts w:ascii="Consolas" w:hAnsi="Consolas"/>
+          <w:sz w:val="20"/>
+        </w:rPr>
+        <w:t>wings_side_folded.png</w:t>
+      </w:r>
+      <w:r>
+        <w:t xml:space="preserve"> из архива переписки). Попроси 3–4 варианта на одном листе:</w:t>
+      </w:r>
+    </w:p>
+    <w:p>
+      <w:pPr>
+        <w:ind w:left="240"/>
+      </w:pPr>
+      <w:r>
+        <w:rPr>
+          <w:rFonts w:ascii="Consolas" w:hAnsi="Consolas"/>
+          <w:color w:val="202050"/>
+          <w:sz w:val="19"/>
+        </w:rPr>
+        <w:t>Use these images as the exact reference for the style and for the wings: four feathered wings, two on each side, the same feathers, white and light grey, thick black outline. The first image shows them spread, seen from behind, in a cross. The second shows them folded, seen from the side. Draw the same four wings spread, seen from the side as if the body faces right, in four different variants on one sheet: each variant shows the upper wing and the lower wing of the near side open at a different angle and in a different pose of a graceful flight, the far-side wings only just visible behind. Elegant, light, beautiful. Each variant alone in its own equal square cell with clear empty space between cells. No body. White background, no text, nothing else.</w:t>
       </w:r>
     </w:p>
     <w:p>

</xml_diff>